<commit_message>
Add unit-cost one-pager, statistical benchmarking memo, public dataset and appendix slides
- Regulatory one-pager: seven cost boundaries with $/kW, $/kWh and what each adds
- Statistical benchmarking memo: reference class (13 utility-owned projects
  <= 100 MWh), log-log regression on 26 public projects (size and duration
  elasticities, 80% prediction interval), Monte Carlo on the thirteen cost
  layers (base and Class 5-like calibrations), estimate-to-actual uplift on
  comparables, ISO interconnection references, AACE and Flyvbjerg citations
- Workbook: Public Projects and Statistics tabs (578 formulas, zero errors)
- Deck: three appendix slides (reference class, regression, Monte Carlo)
- build/data: 44-project public cost dataset with sourcing notes; ISO/FERC/
  state-PUC reference log; model scripts and results

Co-Authored-By: Claude Fable 5.1 <noreply@anthropic.com>
Claude-Session: https://claude.ai/code/session_01YAU7MDk5K6GEm6c4td5TUq
</commit_message>
<xml_diff>
--- a/Hyde Park BESS/6) Cost Analysis Deliverables/Hyde Park BESS - All-In Cost Whitepaper.docx
+++ b/Hyde Park BESS/6) Cost Analysis Deliverables/Hyde Park BESS - All-In Cost Whitepaper.docx
@@ -188,12 +188,13 @@
         <w:tblStyle w:val="TableGrid"/>
         <w:tblW w:type="auto" w:w="0"/>
         <w:jc w:val="center"/>
+        <w:tblLayout w:type="fixed"/>
         <w:tblLook w:firstColumn="1" w:firstRow="1" w:lastColumn="0" w:lastRow="0" w:noHBand="0" w:noVBand="1" w:val="04A0"/>
       </w:tblPr>
       <w:tblGrid>
-        <w:gridCol w:w="3120"/>
-        <w:gridCol w:w="3120"/>
-        <w:gridCol w:w="3120"/>
+        <w:gridCol w:w="6336"/>
+        <w:gridCol w:w="1584"/>
+        <w:gridCol w:w="1152"/>
       </w:tblGrid>
       <w:tr>
         <w:tc>
@@ -876,13 +877,14 @@
         <w:tblStyle w:val="TableGrid"/>
         <w:tblW w:type="auto" w:w="0"/>
         <w:jc w:val="center"/>
+        <w:tblLayout w:type="fixed"/>
         <w:tblLook w:firstColumn="1" w:firstRow="1" w:lastColumn="0" w:lastRow="0" w:noHBand="0" w:noVBand="1" w:val="04A0"/>
       </w:tblPr>
       <w:tblGrid>
-        <w:gridCol w:w="2340"/>
-        <w:gridCol w:w="2340"/>
-        <w:gridCol w:w="2340"/>
-        <w:gridCol w:w="2340"/>
+        <w:gridCol w:w="5040"/>
+        <w:gridCol w:w="1584"/>
+        <w:gridCol w:w="1584"/>
+        <w:gridCol w:w="1008"/>
       </w:tblGrid>
       <w:tr>
         <w:tc>
@@ -2267,15 +2269,16 @@
         <w:tblStyle w:val="TableGrid"/>
         <w:tblW w:type="auto" w:w="0"/>
         <w:jc w:val="center"/>
+        <w:tblLayout w:type="fixed"/>
         <w:tblLook w:firstColumn="1" w:firstRow="1" w:lastColumn="0" w:lastRow="0" w:noHBand="0" w:noVBand="1" w:val="04A0"/>
       </w:tblPr>
       <w:tblGrid>
-        <w:gridCol w:w="1560"/>
-        <w:gridCol w:w="1560"/>
-        <w:gridCol w:w="1560"/>
-        <w:gridCol w:w="1560"/>
-        <w:gridCol w:w="1560"/>
-        <w:gridCol w:w="1560"/>
+        <w:gridCol w:w="2880"/>
+        <w:gridCol w:w="1440"/>
+        <w:gridCol w:w="864"/>
+        <w:gridCol w:w="864"/>
+        <w:gridCol w:w="720"/>
+        <w:gridCol w:w="2592"/>
       </w:tblGrid>
       <w:tr>
         <w:tc>
@@ -3294,15 +3297,16 @@
         <w:tblStyle w:val="TableGrid"/>
         <w:tblW w:type="auto" w:w="0"/>
         <w:jc w:val="center"/>
+        <w:tblLayout w:type="fixed"/>
         <w:tblLook w:firstColumn="1" w:firstRow="1" w:lastColumn="0" w:lastRow="0" w:noHBand="0" w:noVBand="1" w:val="04A0"/>
       </w:tblPr>
       <w:tblGrid>
-        <w:gridCol w:w="1560"/>
-        <w:gridCol w:w="1560"/>
-        <w:gridCol w:w="1560"/>
-        <w:gridCol w:w="1560"/>
-        <w:gridCol w:w="1560"/>
-        <w:gridCol w:w="1560"/>
+        <w:gridCol w:w="2160"/>
+        <w:gridCol w:w="648"/>
+        <w:gridCol w:w="1224"/>
+        <w:gridCol w:w="1296"/>
+        <w:gridCol w:w="3312"/>
+        <w:gridCol w:w="792"/>
       </w:tblGrid>
       <w:tr>
         <w:tc>
@@ -5800,13 +5804,14 @@
         <w:tblStyle w:val="TableGrid"/>
         <w:tblW w:type="auto" w:w="0"/>
         <w:jc w:val="center"/>
+        <w:tblLayout w:type="fixed"/>
         <w:tblLook w:firstColumn="1" w:firstRow="1" w:lastColumn="0" w:lastRow="0" w:noHBand="0" w:noVBand="1" w:val="04A0"/>
       </w:tblPr>
       <w:tblGrid>
-        <w:gridCol w:w="2340"/>
-        <w:gridCol w:w="2340"/>
-        <w:gridCol w:w="2340"/>
-        <w:gridCol w:w="2340"/>
+        <w:gridCol w:w="1152"/>
+        <w:gridCol w:w="3168"/>
+        <w:gridCol w:w="1440"/>
+        <w:gridCol w:w="4032"/>
       </w:tblGrid>
       <w:tr>
         <w:tc>

</xml_diff>

<commit_message>
Add red team report and fold its findings into the deck, BOE, whitepaper and memo
- New Red Team Report (docx): steelman, three kill shots, 14-item challenge
  register, stress tests, risk-register audit, pre-mortem, certification
- Deck: slide 15 open items re-ranked (10 items, HEG reconciliation and
  siting float first); new slides 16-18 (kill shots, stress tests and base
  rates, pre-mortem with early-warning indicators); decisions requested
  updated; appendix C title softened on reserve adequacy
- BOE: missing risk families, spot-generation ownership, Class 4 maturity,
  Station 496 unit-rate check, siting float and early-warning owners
- Whitepaper: present November at Class 4 with a dollar range; plan against
  the combination case
- Memo: reserve wording corrected (covers element ranges, thin vs history)

Co-Authored-By: Claude Fable 5.1 <noreply@anthropic.com>
Claude-Session: https://claude.ai/code/session_01YAU7MDk5K6GEm6c4td5TUq
</commit_message>
<xml_diff>
--- a/Hyde Park BESS/6) Cost Analysis Deliverables/Hyde Park BESS - All-In Cost Whitepaper.docx
+++ b/Hyde Park BESS/6) Cost Analysis Deliverables/Hyde Park BESS - All-In Cost Whitepaper.docx
@@ -7092,7 +7092,22 @@
         <w:t xml:space="preserve">Retire the $43.9 million placeholder in the PAF narrative </w:t>
       </w:r>
       <w:r>
-        <w:t>and present the full-funding request as a Planning-grade estimate once the reconciliations above close, with the layered view as its first exhibit.</w:t>
+        <w:t>and present the full-funding request at its real maturity. Until the geotechnical report, the hazard mitigation analysis and the Haugland reconciliation close, that is Class 4, minus 25 to plus 50 percent; the layered view should be its first exhibit and the range should be stated in dollars, $43 million to $86 million, not in percentages.</w:t>
+      </w:r>
+    </w:p>
+    <w:p>
+      <w:pPr>
+        <w:pStyle w:val="ListBullet"/>
+        <w:spacing w:after="60"/>
+      </w:pPr>
+      <w:r>
+        <w:rPr>
+          <w:b/>
+        </w:rPr>
+        <w:t xml:space="preserve">Plan against the combination case, not the base case. </w:t>
+      </w:r>
+      <w:r>
+        <w:t>The two shocks most likely to travel together are the Haugland reconciliation moving the construction base up and one missed siting season. On the package's own figures that is roughly $13 million and twelve months. History on comparable small utility batteries (Fairhaven +64%, Waena +37%, Regina +31%, Provincetown +9% to +40% from approved to actual) says the 17.9% reserve is not generous.</w:t>
       </w:r>
     </w:p>
     <w:p>

</xml_diff>

<commit_message>
Add battery installed-cost curve and escalation basis slides; Cost Curve workbook tab; whitepaper paragraphs
Answers two challenges raised on the deck: whether an industry installed-cost curve exists and where Hyde Park sits on it, and whether escalation is included. Deck grows to 24 slides (new slides 10 and 11), with a hidden placeholder series to work around LibreOffice dropping scatter series that precede the longest one. Workbook gains a Cost Curve tab (series as published, Hyde Park points, 2-h / 10 MW adjustment, Rev 3 escalation, common-dollar comparison); 617 formulas, zero errors. Research log and README updated.

Co-Authored-By: Claude Fable 5.1 <noreply@anthropic.com>
Claude-Session: https://claude.ai/code/session_01YAU7MDk5K6GEm6c4td5TUq
</commit_message>
<xml_diff>
--- a/Hyde Park BESS/6) Cost Analysis Deliverables/Hyde Park BESS - All-In Cost Whitepaper.docx
+++ b/Hyde Park BESS/6) Cost Analysis Deliverables/Hyde Park BESS - All-In Cost Whitepaper.docx
@@ -7014,6 +7014,30 @@
     </w:p>
     <w:p>
       <w:pPr>
+        <w:spacing w:after="120"/>
+      </w:pPr>
+      <w:r>
+        <w:rPr>
+          <w:b w:val="0"/>
+          <w:i w:val="0"/>
+        </w:rPr>
+        <w:t>Two challenges raised on the deck belong here. The first asks whether there is an installed-cost curve for batteries and where Hyde Park sits on it. There is: EIA's reported all-in cost for utility-scale batteries fell from $2,152 per kWh in 2015 to $625 in 2018; BNEF's turnkey four-hour survey fell from $324 in 2022 to $117 globally and $219 in the United States in 2025; NREL's bottom-up base is $334 in 2024 and $247 by 2035 in its mid case. Every one of those series describes a four-hour system of 60 to 150 MW in real dollars. Hyde Park is a two-hour, 10 MW system priced in nominal 2026 to 2028 dollars. NREL's cost structure puts a two-hour system at 1.3 to 1.5 times the four-hour $/kWh, and the size elasticity estimated in the statistical memo (-0.17) adds a factor of about 1.5 at 20 MWh against a 240 MWh reference. The adjusted United States turnkey figure is $440 to $505 per kWh; Nomad's equipment price is $532. The installed battery, $833, carries $183 per kWh of owner-scope installation, integration and balance of plant that a turnkey index buys inside a developer's EPC contract. The curve, with sources, is slide 10 of the deck and the Cost Curve tab of the workbook.</w:t>
+      </w:r>
+    </w:p>
+    <w:p>
+      <w:pPr>
+        <w:spacing w:after="120"/>
+      </w:pPr>
+      <w:r>
+        <w:rPr>
+          <w:b w:val="0"/>
+          <w:i w:val="0"/>
+        </w:rPr>
+        <w:t>The second challenge asks that escalation be included. It is: the Rev 3 approval level carries $2,948,100 of escalation inside the directs ($2,622,100 at Station 360 and $326,100 at Station 496), applied at the ESF template rates of about 3 percent a year to a spend curve of $13.5 million in 2026, $12.5 million in 2027 and $26.1 million in 2028. That is 5.1 percent of the approval level and $147 per kWh. The contestable part is the $1,130,255 applied to the Nomad balance that the contract fixes until Final Acceptance; the rest sits on station, site, protection, testing and owner scope, where a 3 percent rate is, if anything, light against the 2026 lithium carbonate and tariff moves. For comparison purposes the two sides must share a dollar year. Stripping the station escalation from the direct boundaries gives $593 for the battery as carried, roughly $756 installed and $1,352 for the station complete; bringing the benchmarks forward instead at 3 percent a year gives $376 for NREL's 2024 base in 2028 dollars, which becomes $750 to $870 after the two-hour and 10 MW adjustments, against Hyde Park's $833 installed. The battery, once the dollar year, the duration and the size agree, is on the index. The project is not, for the reasons in sections 3 and 6.</w:t>
+      </w:r>
+    </w:p>
+    <w:p>
+      <w:pPr>
         <w:pStyle w:val="Heading1"/>
       </w:pPr>
       <w:r>

</xml_diff>

<commit_message>
Whitepaper and BOE carry the layer escalators and the savings register; BLS escalator series pulled from the FRED and BLS APIs
- Whitepaper: new 5.3 (one escalator per layer, methods table, scaling recipe), new 8 (savings register, tier totals, Section 48E), recommendations extended, sources appended
- BOE: escalator check in 1.3 and 14 (template 3%/yr vs the published series 2023-2026), risk-register overlap in 18, E&S basis question in 19, AFUDC timing in 20, six new open items in 22
- fetch_indices.py now uses the keyless FRED CSV and BLS v2 endpoints; indices_layers_api.json holds ten BLS series 2014-2026 and overrides the search-excerpt values (results unchanged: composite 1.17x, class median $832)
- Breaker lever sized on the furnish line only; README and research log updated

Co-Authored-By: Claude Fable 5.1 <noreply@anthropic.com>
Claude-Session: https://claude.ai/code/session_01YAU7MDk5K6GEm6c4td5TUq
</commit_message>
<xml_diff>
--- a/Hyde Park BESS/6) Cost Analysis Deliverables/Hyde Park BESS - All-In Cost Whitepaper.docx
+++ b/Hyde Park BESS/6) Cost Analysis Deliverables/Hyde Park BESS - All-In Cost Whitepaper.docx
@@ -118,6 +118,18 @@
       <w:pPr>
         <w:spacing w:after="40"/>
       </w:pPr>
+    </w:p>
+    <w:p>
+      <w:pPr>
+        <w:spacing w:after="120"/>
+      </w:pPr>
+      <w:r>
+        <w:rPr>
+          <w:b w:val="0"/>
+          <w:i w:val="0"/>
+        </w:rPr>
+        <w:t>Two additions on 3 October 2026. First, a reviewer may object that one construction index cannot stand for a substation, a landfill platform and a commissioning team at once; section 5.3 escalates each layer on its own published series (transformers, switchgear, Boston electrical labor, ENR, engineering services) and shows that the answer does not move: the class median stays at $832 per kWh and Hyde Park's station cost at the 85% percentile, because the battery is the only layer that fell since 2018 and every other layer rose by a quarter to nine tenths. Second, section 8 turns the layer extraction around and asks where the $57.2 million could give: $5.0 to 7.1M loaded in estimate hygiene that needs only decisions, $4.3 to 6.9M in value engineering that needs a study first, and a Section 48E investment tax credit of $8.4 to 12.4M that reduces the revenue requirement rather than the estimate and that nobody on the project yet owns.</w:t>
+      </w:r>
     </w:p>
     <w:p>
       <w:pPr>
@@ -6882,6 +6894,2048 @@
     </w:p>
     <w:p>
       <w:pPr>
+        <w:pStyle w:val="Heading2"/>
+      </w:pPr>
+      <w:r>
+        <w:t>5.3 Scaling a published cost to 2026: one escalator per layer</w:t>
+      </w:r>
+    </w:p>
+    <w:p>
+      <w:pPr>
+        <w:spacing w:after="120"/>
+      </w:pPr>
+      <w:r>
+        <w:rPr>
+          <w:b w:val="0"/>
+          <w:i w:val="0"/>
+        </w:rPr>
+        <w:t>Every figure in section 5 was published in a different year, and the comparables in 5.2 are nominal dollars of their in-service year. The statistical memo re-bases them with a two-component model: the battery share of each cost deflated on a battery index and the rest escalated on the Handy-Whitman North Atlantic construction index. The objection a careful reviewer will raise is that the rest is not one thing. A substation does not escalate like a steam plant, Boston electrical labor does not escalate like transformers, and a two-hour utility project has a different mix from a four-hour merchant one. The check below gives each Rev 3 layer its own published series and asks what changes.</w:t>
+      </w:r>
+    </w:p>
+    <w:tbl>
+      <w:tblPr>
+        <w:tblStyle w:val="TableGrid"/>
+        <w:tblW w:type="auto" w:w="0"/>
+        <w:jc w:val="center"/>
+        <w:tblLayout w:type="fixed"/>
+        <w:tblLook w:firstColumn="1" w:firstRow="1" w:lastColumn="0" w:lastRow="0" w:noHBand="0" w:noVBand="1" w:val="04A0"/>
+      </w:tblPr>
+      <w:tblGrid>
+        <w:gridCol w:w="2880"/>
+        <w:gridCol w:w="1296"/>
+        <w:gridCol w:w="4176"/>
+        <w:gridCol w:w="1296"/>
+      </w:tblGrid>
+      <w:tr>
+        <w:tc>
+          <w:tcPr>
+            <w:tcW w:type="dxa" w:w="2880"/>
+            <w:shd w:val="clear" w:color="auto" w:fill="001E60"/>
+          </w:tcPr>
+          <w:p>
+            <w:pPr>
+              <w:spacing w:after="0" w:before="0"/>
+            </w:pPr>
+            <w:r/>
+            <w:r>
+              <w:rPr>
+                <w:b/>
+                <w:i w:val="0"/>
+                <w:color w:val="FFFFFF"/>
+                <w:sz w:val="18"/>
+              </w:rPr>
+              <w:t>Layer</w:t>
+            </w:r>
+          </w:p>
+        </w:tc>
+        <w:tc>
+          <w:tcPr>
+            <w:tcW w:type="dxa" w:w="1296"/>
+            <w:shd w:val="clear" w:color="auto" w:fill="001E60"/>
+          </w:tcPr>
+          <w:p>
+            <w:pPr>
+              <w:spacing w:after="0" w:before="0"/>
+            </w:pPr>
+            <w:r/>
+            <w:r>
+              <w:rPr>
+                <w:b/>
+                <w:i w:val="0"/>
+                <w:color w:val="FFFFFF"/>
+                <w:sz w:val="18"/>
+              </w:rPr>
+              <w:t>Loaded share</w:t>
+            </w:r>
+          </w:p>
+        </w:tc>
+        <w:tc>
+          <w:tcPr>
+            <w:tcW w:type="dxa" w:w="4176"/>
+            <w:shd w:val="clear" w:color="auto" w:fill="001E60"/>
+          </w:tcPr>
+          <w:p>
+            <w:pPr>
+              <w:spacing w:after="0" w:before="0"/>
+            </w:pPr>
+            <w:r/>
+            <w:r>
+              <w:rPr>
+                <w:b/>
+                <w:i w:val="0"/>
+                <w:color w:val="FFFFFF"/>
+                <w:sz w:val="18"/>
+              </w:rPr>
+              <w:t>Escalator</w:t>
+            </w:r>
+          </w:p>
+        </w:tc>
+        <w:tc>
+          <w:tcPr>
+            <w:tcW w:type="dxa" w:w="1296"/>
+            <w:shd w:val="clear" w:color="auto" w:fill="001E60"/>
+          </w:tcPr>
+          <w:p>
+            <w:pPr>
+              <w:spacing w:after="0" w:before="0"/>
+            </w:pPr>
+            <w:r/>
+            <w:r>
+              <w:rPr>
+                <w:b/>
+                <w:i w:val="0"/>
+                <w:color w:val="FFFFFF"/>
+                <w:sz w:val="18"/>
+              </w:rPr>
+              <w:t>2018 to 2026</w:t>
+            </w:r>
+          </w:p>
+        </w:tc>
+      </w:tr>
+      <w:tr>
+        <w:tc>
+          <w:tcPr>
+            <w:tcW w:type="dxa" w:w="2880"/>
+          </w:tcPr>
+          <w:p>
+            <w:pPr>
+              <w:spacing w:after="0" w:before="0"/>
+            </w:pPr>
+            <w:r/>
+            <w:r>
+              <w:rPr>
+                <w:b w:val="0"/>
+                <w:i w:val="0"/>
+                <w:sz w:val="18"/>
+              </w:rPr>
+              <w:t>A. Battery contract</w:t>
+            </w:r>
+          </w:p>
+        </w:tc>
+        <w:tc>
+          <w:tcPr>
+            <w:tcW w:type="dxa" w:w="1296"/>
+          </w:tcPr>
+          <w:p>
+            <w:pPr>
+              <w:spacing w:after="0" w:before="0"/>
+              <w:jc w:val="right"/>
+            </w:pPr>
+            <w:r/>
+            <w:r>
+              <w:rPr>
+                <w:b w:val="0"/>
+                <w:i w:val="0"/>
+                <w:sz w:val="18"/>
+              </w:rPr>
+              <w:t>38%</w:t>
+            </w:r>
+          </w:p>
+        </w:tc>
+        <w:tc>
+          <w:tcPr>
+            <w:tcW w:type="dxa" w:w="4176"/>
+          </w:tcPr>
+          <w:p>
+            <w:pPr>
+              <w:spacing w:after="0" w:before="0"/>
+            </w:pPr>
+            <w:r/>
+            <w:r>
+              <w:rPr>
+                <w:b w:val="0"/>
+                <w:i w:val="0"/>
+                <w:sz w:val="18"/>
+              </w:rPr>
+              <w:t>EIA / LBNL installed battery cost</w:t>
+            </w:r>
+          </w:p>
+        </w:tc>
+        <w:tc>
+          <w:tcPr>
+            <w:tcW w:type="dxa" w:w="1296"/>
+          </w:tcPr>
+          <w:p>
+            <w:pPr>
+              <w:spacing w:after="0" w:before="0"/>
+              <w:jc w:val="right"/>
+            </w:pPr>
+            <w:r/>
+            <w:r>
+              <w:rPr>
+                <w:b w:val="0"/>
+                <w:i w:val="0"/>
+                <w:sz w:val="18"/>
+              </w:rPr>
+              <w:t>0.73x</w:t>
+            </w:r>
+          </w:p>
+        </w:tc>
+      </w:tr>
+      <w:tr>
+        <w:tc>
+          <w:tcPr>
+            <w:tcW w:type="dxa" w:w="2880"/>
+            <w:shd w:val="clear" w:color="auto" w:fill="F2F4F8"/>
+          </w:tcPr>
+          <w:p>
+            <w:pPr>
+              <w:spacing w:after="0" w:before="0"/>
+            </w:pPr>
+            <w:r/>
+            <w:r>
+              <w:rPr>
+                <w:b w:val="0"/>
+                <w:i w:val="0"/>
+                <w:sz w:val="18"/>
+              </w:rPr>
+              <w:t>B. Battery installation</w:t>
+            </w:r>
+          </w:p>
+        </w:tc>
+        <w:tc>
+          <w:tcPr>
+            <w:tcW w:type="dxa" w:w="1296"/>
+            <w:shd w:val="clear" w:color="auto" w:fill="F2F4F8"/>
+          </w:tcPr>
+          <w:p>
+            <w:pPr>
+              <w:spacing w:after="0" w:before="0"/>
+              <w:jc w:val="right"/>
+            </w:pPr>
+            <w:r/>
+            <w:r>
+              <w:rPr>
+                <w:b w:val="0"/>
+                <w:i w:val="0"/>
+                <w:sz w:val="18"/>
+              </w:rPr>
+              <w:t>5%</w:t>
+            </w:r>
+          </w:p>
+        </w:tc>
+        <w:tc>
+          <w:tcPr>
+            <w:tcW w:type="dxa" w:w="4176"/>
+            <w:shd w:val="clear" w:color="auto" w:fill="F2F4F8"/>
+          </w:tcPr>
+          <w:p>
+            <w:pPr>
+              <w:spacing w:after="0" w:before="0"/>
+            </w:pPr>
+            <w:r/>
+            <w:r>
+              <w:rPr>
+                <w:b w:val="0"/>
+                <w:i w:val="0"/>
+                <w:sz w:val="18"/>
+              </w:rPr>
+              <w:t>IBEW Local 103 journeyman rate</w:t>
+            </w:r>
+          </w:p>
+        </w:tc>
+        <w:tc>
+          <w:tcPr>
+            <w:tcW w:type="dxa" w:w="1296"/>
+            <w:shd w:val="clear" w:color="auto" w:fill="F2F4F8"/>
+          </w:tcPr>
+          <w:p>
+            <w:pPr>
+              <w:spacing w:after="0" w:before="0"/>
+              <w:jc w:val="right"/>
+            </w:pPr>
+            <w:r/>
+            <w:r>
+              <w:rPr>
+                <w:b w:val="0"/>
+                <w:i w:val="0"/>
+                <w:sz w:val="18"/>
+              </w:rPr>
+              <w:t>1.30x</w:t>
+            </w:r>
+          </w:p>
+        </w:tc>
+      </w:tr>
+      <w:tr>
+        <w:tc>
+          <w:tcPr>
+            <w:tcW w:type="dxa" w:w="2880"/>
+          </w:tcPr>
+          <w:p>
+            <w:pPr>
+              <w:spacing w:after="0" w:before="0"/>
+            </w:pPr>
+            <w:r/>
+            <w:r>
+              <w:rPr>
+                <w:b w:val="0"/>
+                <w:i w:val="0"/>
+                <w:sz w:val="18"/>
+              </w:rPr>
+              <w:t>C. GSUs and auxiliary power</w:t>
+            </w:r>
+          </w:p>
+        </w:tc>
+        <w:tc>
+          <w:tcPr>
+            <w:tcW w:type="dxa" w:w="1296"/>
+          </w:tcPr>
+          <w:p>
+            <w:pPr>
+              <w:spacing w:after="0" w:before="0"/>
+              <w:jc w:val="right"/>
+            </w:pPr>
+            <w:r/>
+            <w:r>
+              <w:rPr>
+                <w:b w:val="0"/>
+                <w:i w:val="0"/>
+                <w:sz w:val="18"/>
+              </w:rPr>
+              <w:t>6%</w:t>
+            </w:r>
+          </w:p>
+        </w:tc>
+        <w:tc>
+          <w:tcPr>
+            <w:tcW w:type="dxa" w:w="4176"/>
+          </w:tcPr>
+          <w:p>
+            <w:pPr>
+              <w:spacing w:after="0" w:before="0"/>
+            </w:pPr>
+            <w:r/>
+            <w:r>
+              <w:rPr>
+                <w:b w:val="0"/>
+                <w:i w:val="0"/>
+                <w:sz w:val="18"/>
+              </w:rPr>
+              <w:t>BLS PPI, power and distribution transformers</w:t>
+            </w:r>
+          </w:p>
+        </w:tc>
+        <w:tc>
+          <w:tcPr>
+            <w:tcW w:type="dxa" w:w="1296"/>
+          </w:tcPr>
+          <w:p>
+            <w:pPr>
+              <w:spacing w:after="0" w:before="0"/>
+              <w:jc w:val="right"/>
+            </w:pPr>
+            <w:r/>
+            <w:r>
+              <w:rPr>
+                <w:b w:val="0"/>
+                <w:i w:val="0"/>
+                <w:sz w:val="18"/>
+              </w:rPr>
+              <w:t>1.91x</w:t>
+            </w:r>
+          </w:p>
+        </w:tc>
+      </w:tr>
+      <w:tr>
+        <w:tc>
+          <w:tcPr>
+            <w:tcW w:type="dxa" w:w="2880"/>
+            <w:shd w:val="clear" w:color="auto" w:fill="F2F4F8"/>
+          </w:tcPr>
+          <w:p>
+            <w:pPr>
+              <w:spacing w:after="0" w:before="0"/>
+            </w:pPr>
+            <w:r/>
+            <w:r>
+              <w:rPr>
+                <w:b w:val="0"/>
+                <w:i w:val="0"/>
+                <w:sz w:val="18"/>
+              </w:rPr>
+              <w:t>D. Switching station</w:t>
+            </w:r>
+          </w:p>
+        </w:tc>
+        <w:tc>
+          <w:tcPr>
+            <w:tcW w:type="dxa" w:w="1296"/>
+            <w:shd w:val="clear" w:color="auto" w:fill="F2F4F8"/>
+          </w:tcPr>
+          <w:p>
+            <w:pPr>
+              <w:spacing w:after="0" w:before="0"/>
+              <w:jc w:val="right"/>
+            </w:pPr>
+            <w:r/>
+            <w:r>
+              <w:rPr>
+                <w:b w:val="0"/>
+                <w:i w:val="0"/>
+                <w:sz w:val="18"/>
+              </w:rPr>
+              <w:t>11%</w:t>
+            </w:r>
+          </w:p>
+        </w:tc>
+        <w:tc>
+          <w:tcPr>
+            <w:tcW w:type="dxa" w:w="4176"/>
+            <w:shd w:val="clear" w:color="auto" w:fill="F2F4F8"/>
+          </w:tcPr>
+          <w:p>
+            <w:pPr>
+              <w:spacing w:after="0" w:before="0"/>
+            </w:pPr>
+            <w:r/>
+            <w:r>
+              <w:rPr>
+                <w:b w:val="0"/>
+                <w:i w:val="0"/>
+                <w:sz w:val="18"/>
+              </w:rPr>
+              <w:t>BLS PPI, switchgear and switchboard</w:t>
+            </w:r>
+          </w:p>
+        </w:tc>
+        <w:tc>
+          <w:tcPr>
+            <w:tcW w:type="dxa" w:w="1296"/>
+            <w:shd w:val="clear" w:color="auto" w:fill="F2F4F8"/>
+          </w:tcPr>
+          <w:p>
+            <w:pPr>
+              <w:spacing w:after="0" w:before="0"/>
+              <w:jc w:val="right"/>
+            </w:pPr>
+            <w:r/>
+            <w:r>
+              <w:rPr>
+                <w:b w:val="0"/>
+                <w:i w:val="0"/>
+                <w:sz w:val="18"/>
+              </w:rPr>
+              <w:t>1.82x</w:t>
+            </w:r>
+          </w:p>
+        </w:tc>
+      </w:tr>
+      <w:tr>
+        <w:tc>
+          <w:tcPr>
+            <w:tcW w:type="dxa" w:w="2880"/>
+          </w:tcPr>
+          <w:p>
+            <w:pPr>
+              <w:spacing w:after="0" w:before="0"/>
+            </w:pPr>
+            <w:r/>
+            <w:r>
+              <w:rPr>
+                <w:b w:val="0"/>
+                <w:i w:val="0"/>
+                <w:sz w:val="18"/>
+              </w:rPr>
+              <w:t>E. Site and civil</w:t>
+            </w:r>
+          </w:p>
+        </w:tc>
+        <w:tc>
+          <w:tcPr>
+            <w:tcW w:type="dxa" w:w="1296"/>
+          </w:tcPr>
+          <w:p>
+            <w:pPr>
+              <w:spacing w:after="0" w:before="0"/>
+              <w:jc w:val="right"/>
+            </w:pPr>
+            <w:r/>
+            <w:r>
+              <w:rPr>
+                <w:b w:val="0"/>
+                <w:i w:val="0"/>
+                <w:sz w:val="18"/>
+              </w:rPr>
+              <w:t>8%</w:t>
+            </w:r>
+          </w:p>
+        </w:tc>
+        <w:tc>
+          <w:tcPr>
+            <w:tcW w:type="dxa" w:w="4176"/>
+          </w:tcPr>
+          <w:p>
+            <w:pPr>
+              <w:spacing w:after="0" w:before="0"/>
+            </w:pPr>
+            <w:r/>
+            <w:r>
+              <w:rPr>
+                <w:b w:val="0"/>
+                <w:i w:val="0"/>
+                <w:sz w:val="18"/>
+              </w:rPr>
+              <w:t>ENR Construction Cost Index</w:t>
+            </w:r>
+          </w:p>
+        </w:tc>
+        <w:tc>
+          <w:tcPr>
+            <w:tcW w:type="dxa" w:w="1296"/>
+          </w:tcPr>
+          <w:p>
+            <w:pPr>
+              <w:spacing w:after="0" w:before="0"/>
+              <w:jc w:val="right"/>
+            </w:pPr>
+            <w:r/>
+            <w:r>
+              <w:rPr>
+                <w:b w:val="0"/>
+                <w:i w:val="0"/>
+                <w:sz w:val="18"/>
+              </w:rPr>
+              <w:t>1.26x</w:t>
+            </w:r>
+          </w:p>
+        </w:tc>
+      </w:tr>
+      <w:tr>
+        <w:tc>
+          <w:tcPr>
+            <w:tcW w:type="dxa" w:w="2880"/>
+            <w:shd w:val="clear" w:color="auto" w:fill="F2F4F8"/>
+          </w:tcPr>
+          <w:p>
+            <w:pPr>
+              <w:spacing w:after="0" w:before="0"/>
+            </w:pPr>
+            <w:r/>
+            <w:r>
+              <w:rPr>
+                <w:b w:val="0"/>
+                <w:i w:val="0"/>
+                <w:sz w:val="18"/>
+              </w:rPr>
+              <w:t>F. Feeder protection (Station 496)</w:t>
+            </w:r>
+          </w:p>
+        </w:tc>
+        <w:tc>
+          <w:tcPr>
+            <w:tcW w:type="dxa" w:w="1296"/>
+            <w:shd w:val="clear" w:color="auto" w:fill="F2F4F8"/>
+          </w:tcPr>
+          <w:p>
+            <w:pPr>
+              <w:spacing w:after="0" w:before="0"/>
+              <w:jc w:val="right"/>
+            </w:pPr>
+            <w:r/>
+            <w:r>
+              <w:rPr>
+                <w:b w:val="0"/>
+                <w:i w:val="0"/>
+                <w:sz w:val="18"/>
+              </w:rPr>
+              <w:t>13%</w:t>
+            </w:r>
+          </w:p>
+        </w:tc>
+        <w:tc>
+          <w:tcPr>
+            <w:tcW w:type="dxa" w:w="4176"/>
+            <w:shd w:val="clear" w:color="auto" w:fill="F2F4F8"/>
+          </w:tcPr>
+          <w:p>
+            <w:pPr>
+              <w:spacing w:after="0" w:before="0"/>
+            </w:pPr>
+            <w:r/>
+            <w:r>
+              <w:rPr>
+                <w:b w:val="0"/>
+                <w:i w:val="0"/>
+                <w:sz w:val="18"/>
+              </w:rPr>
+              <w:t>IBEW Local 103 journeyman rate</w:t>
+            </w:r>
+          </w:p>
+        </w:tc>
+        <w:tc>
+          <w:tcPr>
+            <w:tcW w:type="dxa" w:w="1296"/>
+            <w:shd w:val="clear" w:color="auto" w:fill="F2F4F8"/>
+          </w:tcPr>
+          <w:p>
+            <w:pPr>
+              <w:spacing w:after="0" w:before="0"/>
+              <w:jc w:val="right"/>
+            </w:pPr>
+            <w:r/>
+            <w:r>
+              <w:rPr>
+                <w:b w:val="0"/>
+                <w:i w:val="0"/>
+                <w:sz w:val="18"/>
+              </w:rPr>
+              <w:t>1.30x</w:t>
+            </w:r>
+          </w:p>
+        </w:tc>
+      </w:tr>
+      <w:tr>
+        <w:tc>
+          <w:tcPr>
+            <w:tcW w:type="dxa" w:w="2880"/>
+          </w:tcPr>
+          <w:p>
+            <w:pPr>
+              <w:spacing w:after="0" w:before="0"/>
+            </w:pPr>
+            <w:r/>
+            <w:r>
+              <w:rPr>
+                <w:b w:val="0"/>
+                <w:i w:val="0"/>
+                <w:sz w:val="18"/>
+              </w:rPr>
+              <w:t>G. Testing and commissioning</w:t>
+            </w:r>
+          </w:p>
+        </w:tc>
+        <w:tc>
+          <w:tcPr>
+            <w:tcW w:type="dxa" w:w="1296"/>
+          </w:tcPr>
+          <w:p>
+            <w:pPr>
+              <w:spacing w:after="0" w:before="0"/>
+              <w:jc w:val="right"/>
+            </w:pPr>
+            <w:r/>
+            <w:r>
+              <w:rPr>
+                <w:b w:val="0"/>
+                <w:i w:val="0"/>
+                <w:sz w:val="18"/>
+              </w:rPr>
+              <w:t>4%</w:t>
+            </w:r>
+          </w:p>
+        </w:tc>
+        <w:tc>
+          <w:tcPr>
+            <w:tcW w:type="dxa" w:w="4176"/>
+          </w:tcPr>
+          <w:p>
+            <w:pPr>
+              <w:spacing w:after="0" w:before="0"/>
+            </w:pPr>
+            <w:r/>
+            <w:r>
+              <w:rPr>
+                <w:b w:val="0"/>
+                <w:i w:val="0"/>
+                <w:sz w:val="18"/>
+              </w:rPr>
+              <w:t>IBEW Local 103 journeyman rate</w:t>
+            </w:r>
+          </w:p>
+        </w:tc>
+        <w:tc>
+          <w:tcPr>
+            <w:tcW w:type="dxa" w:w="1296"/>
+          </w:tcPr>
+          <w:p>
+            <w:pPr>
+              <w:spacing w:after="0" w:before="0"/>
+              <w:jc w:val="right"/>
+            </w:pPr>
+            <w:r/>
+            <w:r>
+              <w:rPr>
+                <w:b w:val="0"/>
+                <w:i w:val="0"/>
+                <w:sz w:val="18"/>
+              </w:rPr>
+              <w:t>1.30x</w:t>
+            </w:r>
+          </w:p>
+        </w:tc>
+      </w:tr>
+      <w:tr>
+        <w:tc>
+          <w:tcPr>
+            <w:tcW w:type="dxa" w:w="2880"/>
+            <w:shd w:val="clear" w:color="auto" w:fill="F2F4F8"/>
+          </w:tcPr>
+          <w:p>
+            <w:pPr>
+              <w:spacing w:after="0" w:before="0"/>
+            </w:pPr>
+            <w:r/>
+            <w:r>
+              <w:rPr>
+                <w:b w:val="0"/>
+                <w:i w:val="0"/>
+                <w:sz w:val="18"/>
+              </w:rPr>
+              <w:t>H. Owner soft costs</w:t>
+            </w:r>
+          </w:p>
+        </w:tc>
+        <w:tc>
+          <w:tcPr>
+            <w:tcW w:type="dxa" w:w="1296"/>
+            <w:shd w:val="clear" w:color="auto" w:fill="F2F4F8"/>
+          </w:tcPr>
+          <w:p>
+            <w:pPr>
+              <w:spacing w:after="0" w:before="0"/>
+              <w:jc w:val="right"/>
+            </w:pPr>
+            <w:r/>
+            <w:r>
+              <w:rPr>
+                <w:b w:val="0"/>
+                <w:i w:val="0"/>
+                <w:sz w:val="18"/>
+              </w:rPr>
+              <w:t>13%</w:t>
+            </w:r>
+          </w:p>
+        </w:tc>
+        <w:tc>
+          <w:tcPr>
+            <w:tcW w:type="dxa" w:w="4176"/>
+            <w:shd w:val="clear" w:color="auto" w:fill="F2F4F8"/>
+          </w:tcPr>
+          <w:p>
+            <w:pPr>
+              <w:spacing w:after="0" w:before="0"/>
+            </w:pPr>
+            <w:r/>
+            <w:r>
+              <w:rPr>
+                <w:b w:val="0"/>
+                <w:i w:val="0"/>
+                <w:sz w:val="18"/>
+              </w:rPr>
+              <w:t>BLS PPI, engineering services</w:t>
+            </w:r>
+          </w:p>
+        </w:tc>
+        <w:tc>
+          <w:tcPr>
+            <w:tcW w:type="dxa" w:w="1296"/>
+            <w:shd w:val="clear" w:color="auto" w:fill="F2F4F8"/>
+          </w:tcPr>
+          <w:p>
+            <w:pPr>
+              <w:spacing w:after="0" w:before="0"/>
+              <w:jc w:val="right"/>
+            </w:pPr>
+            <w:r/>
+            <w:r>
+              <w:rPr>
+                <w:b w:val="0"/>
+                <w:i w:val="0"/>
+                <w:sz w:val="18"/>
+              </w:rPr>
+              <w:t>1.25x</w:t>
+            </w:r>
+          </w:p>
+        </w:tc>
+      </w:tr>
+      <w:tr>
+        <w:tc>
+          <w:tcPr>
+            <w:tcW w:type="dxa" w:w="2880"/>
+          </w:tcPr>
+          <w:p>
+            <w:pPr>
+              <w:spacing w:after="0" w:before="0"/>
+            </w:pPr>
+            <w:r/>
+            <w:r>
+              <w:rPr>
+                <w:b w:val="0"/>
+                <w:i w:val="0"/>
+                <w:sz w:val="18"/>
+              </w:rPr>
+              <w:t>I. Taxes and insurance</w:t>
+            </w:r>
+          </w:p>
+        </w:tc>
+        <w:tc>
+          <w:tcPr>
+            <w:tcW w:type="dxa" w:w="1296"/>
+          </w:tcPr>
+          <w:p>
+            <w:pPr>
+              <w:spacing w:after="0" w:before="0"/>
+              <w:jc w:val="right"/>
+            </w:pPr>
+            <w:r/>
+            <w:r>
+              <w:rPr>
+                <w:b w:val="0"/>
+                <w:i w:val="0"/>
+                <w:sz w:val="18"/>
+              </w:rPr>
+              <w:t>2%</w:t>
+            </w:r>
+          </w:p>
+        </w:tc>
+        <w:tc>
+          <w:tcPr>
+            <w:tcW w:type="dxa" w:w="4176"/>
+          </w:tcPr>
+          <w:p>
+            <w:pPr>
+              <w:spacing w:after="0" w:before="0"/>
+            </w:pPr>
+            <w:r/>
+            <w:r>
+              <w:rPr>
+                <w:b w:val="0"/>
+                <w:i w:val="0"/>
+                <w:sz w:val="18"/>
+              </w:rPr>
+              <w:t>Handy-Whitman, North Atlantic</w:t>
+            </w:r>
+          </w:p>
+        </w:tc>
+        <w:tc>
+          <w:tcPr>
+            <w:tcW w:type="dxa" w:w="1296"/>
+          </w:tcPr>
+          <w:p>
+            <w:pPr>
+              <w:spacing w:after="0" w:before="0"/>
+              <w:jc w:val="right"/>
+            </w:pPr>
+            <w:r/>
+            <w:r>
+              <w:rPr>
+                <w:b w:val="0"/>
+                <w:i w:val="0"/>
+                <w:sz w:val="18"/>
+              </w:rPr>
+              <w:t>1.49x</w:t>
+            </w:r>
+          </w:p>
+        </w:tc>
+      </w:tr>
+      <w:tr>
+        <w:tc>
+          <w:tcPr>
+            <w:tcW w:type="dxa" w:w="2880"/>
+            <w:shd w:val="clear" w:color="auto" w:fill="F2F4F8"/>
+          </w:tcPr>
+          <w:p>
+            <w:pPr>
+              <w:spacing w:after="0" w:before="0"/>
+            </w:pPr>
+            <w:r/>
+            <w:r>
+              <w:rPr>
+                <w:b w:val="0"/>
+                <w:i w:val="0"/>
+                <w:sz w:val="18"/>
+              </w:rPr>
+              <w:t>Composite, Hyde Park weights</w:t>
+            </w:r>
+          </w:p>
+        </w:tc>
+        <w:tc>
+          <w:tcPr>
+            <w:tcW w:type="dxa" w:w="1296"/>
+            <w:shd w:val="clear" w:color="auto" w:fill="F2F4F8"/>
+          </w:tcPr>
+          <w:p>
+            <w:pPr>
+              <w:spacing w:after="0" w:before="0"/>
+              <w:jc w:val="right"/>
+            </w:pPr>
+            <w:r/>
+            <w:r>
+              <w:rPr>
+                <w:b w:val="0"/>
+                <w:i w:val="0"/>
+                <w:sz w:val="18"/>
+              </w:rPr>
+              <w:t>100%</w:t>
+            </w:r>
+          </w:p>
+        </w:tc>
+        <w:tc>
+          <w:tcPr>
+            <w:tcW w:type="dxa" w:w="4176"/>
+            <w:shd w:val="clear" w:color="auto" w:fill="F2F4F8"/>
+          </w:tcPr>
+          <w:p>
+            <w:pPr>
+              <w:spacing w:after="0" w:before="0"/>
+            </w:pPr>
+            <w:r/>
+            <w:r>
+              <w:rPr>
+                <w:b w:val="0"/>
+                <w:i w:val="0"/>
+                <w:sz w:val="18"/>
+              </w:rPr>
+              <w:t>weighted sum</w:t>
+            </w:r>
+          </w:p>
+        </w:tc>
+        <w:tc>
+          <w:tcPr>
+            <w:tcW w:type="dxa" w:w="1296"/>
+            <w:shd w:val="clear" w:color="auto" w:fill="F2F4F8"/>
+          </w:tcPr>
+          <w:p>
+            <w:pPr>
+              <w:spacing w:after="0" w:before="0"/>
+              <w:jc w:val="right"/>
+            </w:pPr>
+            <w:r/>
+            <w:r>
+              <w:rPr>
+                <w:b w:val="0"/>
+                <w:i w:val="0"/>
+                <w:sz w:val="18"/>
+              </w:rPr>
+              <w:t>1.17x</w:t>
+            </w:r>
+          </w:p>
+        </w:tc>
+      </w:tr>
+    </w:tbl>
+    <w:p>
+      <w:pPr>
+        <w:spacing w:after="40"/>
+      </w:pPr>
+    </w:p>
+    <w:p>
+      <w:pPr>
+        <w:spacing w:after="120"/>
+      </w:pPr>
+      <w:r>
+        <w:rPr>
+          <w:b w:val="0"/>
+          <w:i w:val="0"/>
+        </w:rPr>
+        <w:t>Five non-battery series stand between 1.25x and 1.91x since 2018; the installed battery index stands at 0.73x. Weighted by the Rev 3 loaded layers, a 2018 project built the way Hyde Park is built costs 1.17x in 2026 dollars. The two-component model gives 1.19x; deflating the whole cost at the battery rate, which is what the 'batteries were four times the price' argument does, gives 0.73x. Transformers (1.91x) and switchgear (1.82x) are the fastest risers, so a station-heavy utility project has escalated faster than a battery-heavy merchant one, not slower.</w:t>
+      </w:r>
+    </w:p>
+    <w:tbl>
+      <w:tblPr>
+        <w:tblStyle w:val="TableGrid"/>
+        <w:tblW w:type="auto" w:w="0"/>
+        <w:jc w:val="center"/>
+        <w:tblLayout w:type="fixed"/>
+        <w:tblLook w:firstColumn="1" w:firstRow="1" w:lastColumn="0" w:lastRow="0" w:noHBand="0" w:noVBand="1" w:val="04A0"/>
+      </w:tblPr>
+      <w:tblGrid>
+        <w:gridCol w:w="3312"/>
+        <w:gridCol w:w="1440"/>
+        <w:gridCol w:w="1440"/>
+        <w:gridCol w:w="1584"/>
+        <w:gridCol w:w="1440"/>
+        <w:gridCol w:w="1440"/>
+      </w:tblGrid>
+      <w:tr>
+        <w:tc>
+          <w:tcPr>
+            <w:tcW w:type="dxa" w:w="3312"/>
+            <w:shd w:val="clear" w:color="auto" w:fill="001E60"/>
+          </w:tcPr>
+          <w:p>
+            <w:pPr>
+              <w:spacing w:after="0" w:before="0"/>
+            </w:pPr>
+            <w:r/>
+            <w:r>
+              <w:rPr>
+                <w:b/>
+                <w:i w:val="0"/>
+                <w:color w:val="FFFFFF"/>
+                <w:sz w:val="18"/>
+              </w:rPr>
+              <w:t>Method</w:t>
+            </w:r>
+          </w:p>
+        </w:tc>
+        <w:tc>
+          <w:tcPr>
+            <w:tcW w:type="dxa" w:w="1440"/>
+            <w:shd w:val="clear" w:color="auto" w:fill="001E60"/>
+          </w:tcPr>
+          <w:p>
+            <w:pPr>
+              <w:spacing w:after="0" w:before="0"/>
+            </w:pPr>
+            <w:r/>
+            <w:r>
+              <w:rPr>
+                <w:b/>
+                <w:i w:val="0"/>
+                <w:color w:val="FFFFFF"/>
+                <w:sz w:val="18"/>
+              </w:rPr>
+              <w:t>Class median $/kWh</w:t>
+            </w:r>
+          </w:p>
+        </w:tc>
+        <w:tc>
+          <w:tcPr>
+            <w:tcW w:type="dxa" w:w="1440"/>
+            <w:shd w:val="clear" w:color="auto" w:fill="001E60"/>
+          </w:tcPr>
+          <w:p>
+            <w:pPr>
+              <w:spacing w:after="0" w:before="0"/>
+            </w:pPr>
+            <w:r/>
+            <w:r>
+              <w:rPr>
+                <w:b/>
+                <w:i w:val="0"/>
+                <w:color w:val="FFFFFF"/>
+                <w:sz w:val="18"/>
+              </w:rPr>
+              <w:t>Hyde Park installed, pct</w:t>
+            </w:r>
+          </w:p>
+        </w:tc>
+        <w:tc>
+          <w:tcPr>
+            <w:tcW w:type="dxa" w:w="1584"/>
+            <w:shd w:val="clear" w:color="auto" w:fill="001E60"/>
+          </w:tcPr>
+          <w:p>
+            <w:pPr>
+              <w:spacing w:after="0" w:before="0"/>
+            </w:pPr>
+            <w:r/>
+            <w:r>
+              <w:rPr>
+                <w:b/>
+                <w:i w:val="0"/>
+                <w:color w:val="FFFFFF"/>
+                <w:sz w:val="18"/>
+              </w:rPr>
+              <w:t>Hyde Park station direct, pct</w:t>
+            </w:r>
+          </w:p>
+        </w:tc>
+        <w:tc>
+          <w:tcPr>
+            <w:tcW w:type="dxa" w:w="1440"/>
+            <w:shd w:val="clear" w:color="auto" w:fill="001E60"/>
+          </w:tcPr>
+          <w:p>
+            <w:pPr>
+              <w:spacing w:after="0" w:before="0"/>
+            </w:pPr>
+            <w:r/>
+            <w:r>
+              <w:rPr>
+                <w:b/>
+                <w:i w:val="0"/>
+                <w:color w:val="FFFFFF"/>
+                <w:sz w:val="18"/>
+              </w:rPr>
+              <w:t>Utility subclass median</w:t>
+            </w:r>
+          </w:p>
+        </w:tc>
+        <w:tc>
+          <w:tcPr>
+            <w:tcW w:type="dxa" w:w="1440"/>
+            <w:shd w:val="clear" w:color="auto" w:fill="001E60"/>
+          </w:tcPr>
+          <w:p>
+            <w:pPr>
+              <w:spacing w:after="0" w:before="0"/>
+            </w:pPr>
+            <w:r/>
+            <w:r>
+              <w:rPr>
+                <w:b/>
+                <w:i w:val="0"/>
+                <w:color w:val="FFFFFF"/>
+                <w:sz w:val="18"/>
+              </w:rPr>
+              <w:t>Station pct, utility subclass</w:t>
+            </w:r>
+          </w:p>
+        </w:tc>
+      </w:tr>
+      <w:tr>
+        <w:tc>
+          <w:tcPr>
+            <w:tcW w:type="dxa" w:w="3312"/>
+          </w:tcPr>
+          <w:p>
+            <w:pPr>
+              <w:spacing w:after="0" w:before="0"/>
+            </w:pPr>
+            <w:r/>
+            <w:r>
+              <w:rPr>
+                <w:b w:val="0"/>
+                <w:i w:val="0"/>
+                <w:sz w:val="18"/>
+              </w:rPr>
+              <w:t>As published</w:t>
+            </w:r>
+          </w:p>
+        </w:tc>
+        <w:tc>
+          <w:tcPr>
+            <w:tcW w:type="dxa" w:w="1440"/>
+          </w:tcPr>
+          <w:p>
+            <w:pPr>
+              <w:spacing w:after="0" w:before="0"/>
+              <w:jc w:val="right"/>
+            </w:pPr>
+            <w:r/>
+            <w:r>
+              <w:rPr>
+                <w:b w:val="0"/>
+                <w:i w:val="0"/>
+                <w:sz w:val="18"/>
+              </w:rPr>
+              <w:t>$771</w:t>
+            </w:r>
+          </w:p>
+        </w:tc>
+        <w:tc>
+          <w:tcPr>
+            <w:tcW w:type="dxa" w:w="1440"/>
+          </w:tcPr>
+          <w:p>
+            <w:pPr>
+              <w:spacing w:after="0" w:before="0"/>
+              <w:jc w:val="right"/>
+            </w:pPr>
+            <w:r/>
+            <w:r>
+              <w:rPr>
+                <w:b w:val="0"/>
+                <w:i w:val="0"/>
+                <w:sz w:val="18"/>
+              </w:rPr>
+              <w:t>58%</w:t>
+            </w:r>
+          </w:p>
+        </w:tc>
+        <w:tc>
+          <w:tcPr>
+            <w:tcW w:type="dxa" w:w="1584"/>
+          </w:tcPr>
+          <w:p>
+            <w:pPr>
+              <w:spacing w:after="0" w:before="0"/>
+              <w:jc w:val="right"/>
+            </w:pPr>
+            <w:r/>
+            <w:r>
+              <w:rPr>
+                <w:b w:val="0"/>
+                <w:i w:val="0"/>
+                <w:sz w:val="18"/>
+              </w:rPr>
+              <w:t>85%</w:t>
+            </w:r>
+          </w:p>
+        </w:tc>
+        <w:tc>
+          <w:tcPr>
+            <w:tcW w:type="dxa" w:w="1440"/>
+          </w:tcPr>
+          <w:p>
+            <w:pPr>
+              <w:spacing w:after="0" w:before="0"/>
+              <w:jc w:val="right"/>
+            </w:pPr>
+            <w:r/>
+            <w:r>
+              <w:rPr>
+                <w:b w:val="0"/>
+                <w:i w:val="0"/>
+                <w:sz w:val="18"/>
+              </w:rPr>
+              <w:t>$986</w:t>
+            </w:r>
+          </w:p>
+        </w:tc>
+        <w:tc>
+          <w:tcPr>
+            <w:tcW w:type="dxa" w:w="1440"/>
+          </w:tcPr>
+          <w:p>
+            <w:pPr>
+              <w:spacing w:after="0" w:before="0"/>
+              <w:jc w:val="right"/>
+            </w:pPr>
+            <w:r/>
+            <w:r>
+              <w:rPr>
+                <w:b w:val="0"/>
+                <w:i w:val="0"/>
+                <w:sz w:val="18"/>
+              </w:rPr>
+              <w:t>74%</w:t>
+            </w:r>
+          </w:p>
+        </w:tc>
+      </w:tr>
+      <w:tr>
+        <w:tc>
+          <w:tcPr>
+            <w:tcW w:type="dxa" w:w="3312"/>
+            <w:shd w:val="clear" w:color="auto" w:fill="F2F4F8"/>
+          </w:tcPr>
+          <w:p>
+            <w:pPr>
+              <w:spacing w:after="0" w:before="0"/>
+            </w:pPr>
+            <w:r/>
+            <w:r>
+              <w:rPr>
+                <w:b w:val="0"/>
+                <w:i w:val="0"/>
+                <w:sz w:val="18"/>
+              </w:rPr>
+              <w:t>Whole cost at the battery rate</w:t>
+            </w:r>
+          </w:p>
+        </w:tc>
+        <w:tc>
+          <w:tcPr>
+            <w:tcW w:type="dxa" w:w="1440"/>
+            <w:shd w:val="clear" w:color="auto" w:fill="F2F4F8"/>
+          </w:tcPr>
+          <w:p>
+            <w:pPr>
+              <w:spacing w:after="0" w:before="0"/>
+              <w:jc w:val="right"/>
+            </w:pPr>
+            <w:r/>
+            <w:r>
+              <w:rPr>
+                <w:b w:val="0"/>
+                <w:i w:val="0"/>
+                <w:sz w:val="18"/>
+              </w:rPr>
+              <w:t>$620</w:t>
+            </w:r>
+          </w:p>
+        </w:tc>
+        <w:tc>
+          <w:tcPr>
+            <w:tcW w:type="dxa" w:w="1440"/>
+            <w:shd w:val="clear" w:color="auto" w:fill="F2F4F8"/>
+          </w:tcPr>
+          <w:p>
+            <w:pPr>
+              <w:spacing w:after="0" w:before="0"/>
+              <w:jc w:val="right"/>
+            </w:pPr>
+            <w:r/>
+            <w:r>
+              <w:rPr>
+                <w:b w:val="0"/>
+                <w:i w:val="0"/>
+                <w:sz w:val="18"/>
+              </w:rPr>
+              <w:t>67%</w:t>
+            </w:r>
+          </w:p>
+        </w:tc>
+        <w:tc>
+          <w:tcPr>
+            <w:tcW w:type="dxa" w:w="1584"/>
+            <w:shd w:val="clear" w:color="auto" w:fill="F2F4F8"/>
+          </w:tcPr>
+          <w:p>
+            <w:pPr>
+              <w:spacing w:after="0" w:before="0"/>
+              <w:jc w:val="right"/>
+            </w:pPr>
+            <w:r/>
+            <w:r>
+              <w:rPr>
+                <w:b w:val="0"/>
+                <w:i w:val="0"/>
+                <w:sz w:val="18"/>
+              </w:rPr>
+              <w:t>95%</w:t>
+            </w:r>
+          </w:p>
+        </w:tc>
+        <w:tc>
+          <w:tcPr>
+            <w:tcW w:type="dxa" w:w="1440"/>
+            <w:shd w:val="clear" w:color="auto" w:fill="F2F4F8"/>
+          </w:tcPr>
+          <w:p>
+            <w:pPr>
+              <w:spacing w:after="0" w:before="0"/>
+              <w:jc w:val="right"/>
+            </w:pPr>
+            <w:r/>
+            <w:r>
+              <w:rPr>
+                <w:b w:val="0"/>
+                <w:i w:val="0"/>
+                <w:sz w:val="18"/>
+              </w:rPr>
+              <w:t>$610</w:t>
+            </w:r>
+          </w:p>
+        </w:tc>
+        <w:tc>
+          <w:tcPr>
+            <w:tcW w:type="dxa" w:w="1440"/>
+            <w:shd w:val="clear" w:color="auto" w:fill="F2F4F8"/>
+          </w:tcPr>
+          <w:p>
+            <w:pPr>
+              <w:spacing w:after="0" w:before="0"/>
+              <w:jc w:val="right"/>
+            </w:pPr>
+            <w:r/>
+            <w:r>
+              <w:rPr>
+                <w:b w:val="0"/>
+                <w:i w:val="0"/>
+                <w:sz w:val="18"/>
+              </w:rPr>
+              <w:t>90%</w:t>
+            </w:r>
+          </w:p>
+        </w:tc>
+      </w:tr>
+      <w:tr>
+        <w:tc>
+          <w:tcPr>
+            <w:tcW w:type="dxa" w:w="3312"/>
+          </w:tcPr>
+          <w:p>
+            <w:pPr>
+              <w:spacing w:after="0" w:before="0"/>
+            </w:pPr>
+            <w:r/>
+            <w:r>
+              <w:rPr>
+                <w:b w:val="0"/>
+                <w:i w:val="0"/>
+                <w:sz w:val="18"/>
+              </w:rPr>
+              <w:t>Battery 40%, Handy-Whitman 60%</w:t>
+            </w:r>
+          </w:p>
+        </w:tc>
+        <w:tc>
+          <w:tcPr>
+            <w:tcW w:type="dxa" w:w="1440"/>
+          </w:tcPr>
+          <w:p>
+            <w:pPr>
+              <w:spacing w:after="0" w:before="0"/>
+              <w:jc w:val="right"/>
+            </w:pPr>
+            <w:r/>
+            <w:r>
+              <w:rPr>
+                <w:b w:val="0"/>
+                <w:i w:val="0"/>
+                <w:sz w:val="18"/>
+              </w:rPr>
+              <w:t>$832</w:t>
+            </w:r>
+          </w:p>
+        </w:tc>
+        <w:tc>
+          <w:tcPr>
+            <w:tcW w:type="dxa" w:w="1440"/>
+          </w:tcPr>
+          <w:p>
+            <w:pPr>
+              <w:spacing w:after="0" w:before="0"/>
+              <w:jc w:val="right"/>
+            </w:pPr>
+            <w:r/>
+            <w:r>
+              <w:rPr>
+                <w:b w:val="0"/>
+                <w:i w:val="0"/>
+                <w:sz w:val="18"/>
+              </w:rPr>
+              <w:t>51%</w:t>
+            </w:r>
+          </w:p>
+        </w:tc>
+        <w:tc>
+          <w:tcPr>
+            <w:tcW w:type="dxa" w:w="1584"/>
+          </w:tcPr>
+          <w:p>
+            <w:pPr>
+              <w:spacing w:after="0" w:before="0"/>
+              <w:jc w:val="right"/>
+            </w:pPr>
+            <w:r/>
+            <w:r>
+              <w:rPr>
+                <w:b w:val="0"/>
+                <w:i w:val="0"/>
+                <w:sz w:val="18"/>
+              </w:rPr>
+              <w:t>85%</w:t>
+            </w:r>
+          </w:p>
+        </w:tc>
+        <w:tc>
+          <w:tcPr>
+            <w:tcW w:type="dxa" w:w="1440"/>
+          </w:tcPr>
+          <w:p>
+            <w:pPr>
+              <w:spacing w:after="0" w:before="0"/>
+              <w:jc w:val="right"/>
+            </w:pPr>
+            <w:r/>
+            <w:r>
+              <w:rPr>
+                <w:b w:val="0"/>
+                <w:i w:val="0"/>
+                <w:sz w:val="18"/>
+              </w:rPr>
+              <w:t>$1,057</w:t>
+            </w:r>
+          </w:p>
+        </w:tc>
+        <w:tc>
+          <w:tcPr>
+            <w:tcW w:type="dxa" w:w="1440"/>
+          </w:tcPr>
+          <w:p>
+            <w:pPr>
+              <w:spacing w:after="0" w:before="0"/>
+              <w:jc w:val="right"/>
+            </w:pPr>
+            <w:r/>
+            <w:r>
+              <w:rPr>
+                <w:b w:val="0"/>
+                <w:i w:val="0"/>
+                <w:sz w:val="18"/>
+              </w:rPr>
+              <w:t>74%</w:t>
+            </w:r>
+          </w:p>
+        </w:tc>
+      </w:tr>
+      <w:tr>
+        <w:tc>
+          <w:tcPr>
+            <w:tcW w:type="dxa" w:w="3312"/>
+            <w:shd w:val="clear" w:color="auto" w:fill="F2F4F8"/>
+          </w:tcPr>
+          <w:p>
+            <w:pPr>
+              <w:spacing w:after="0" w:before="0"/>
+            </w:pPr>
+            <w:r/>
+            <w:r>
+              <w:rPr>
+                <w:b w:val="0"/>
+                <w:i w:val="0"/>
+                <w:sz w:val="18"/>
+              </w:rPr>
+              <w:t>One index per layer, developer weights</w:t>
+            </w:r>
+          </w:p>
+        </w:tc>
+        <w:tc>
+          <w:tcPr>
+            <w:tcW w:type="dxa" w:w="1440"/>
+            <w:shd w:val="clear" w:color="auto" w:fill="F2F4F8"/>
+          </w:tcPr>
+          <w:p>
+            <w:pPr>
+              <w:spacing w:after="0" w:before="0"/>
+              <w:jc w:val="right"/>
+            </w:pPr>
+            <w:r/>
+            <w:r>
+              <w:rPr>
+                <w:b w:val="0"/>
+                <w:i w:val="0"/>
+                <w:sz w:val="18"/>
+              </w:rPr>
+              <w:t>$832</w:t>
+            </w:r>
+          </w:p>
+        </w:tc>
+        <w:tc>
+          <w:tcPr>
+            <w:tcW w:type="dxa" w:w="1440"/>
+            <w:shd w:val="clear" w:color="auto" w:fill="F2F4F8"/>
+          </w:tcPr>
+          <w:p>
+            <w:pPr>
+              <w:spacing w:after="0" w:before="0"/>
+              <w:jc w:val="right"/>
+            </w:pPr>
+            <w:r/>
+            <w:r>
+              <w:rPr>
+                <w:b w:val="0"/>
+                <w:i w:val="0"/>
+                <w:sz w:val="18"/>
+              </w:rPr>
+              <w:t>51%</w:t>
+            </w:r>
+          </w:p>
+        </w:tc>
+        <w:tc>
+          <w:tcPr>
+            <w:tcW w:type="dxa" w:w="1584"/>
+            <w:shd w:val="clear" w:color="auto" w:fill="F2F4F8"/>
+          </w:tcPr>
+          <w:p>
+            <w:pPr>
+              <w:spacing w:after="0" w:before="0"/>
+              <w:jc w:val="right"/>
+            </w:pPr>
+            <w:r/>
+            <w:r>
+              <w:rPr>
+                <w:b w:val="0"/>
+                <w:i w:val="0"/>
+                <w:sz w:val="18"/>
+              </w:rPr>
+              <w:t>85%</w:t>
+            </w:r>
+          </w:p>
+        </w:tc>
+        <w:tc>
+          <w:tcPr>
+            <w:tcW w:type="dxa" w:w="1440"/>
+            <w:shd w:val="clear" w:color="auto" w:fill="F2F4F8"/>
+          </w:tcPr>
+          <w:p>
+            <w:pPr>
+              <w:spacing w:after="0" w:before="0"/>
+              <w:jc w:val="right"/>
+            </w:pPr>
+            <w:r/>
+            <w:r>
+              <w:rPr>
+                <w:b w:val="0"/>
+                <w:i w:val="0"/>
+                <w:sz w:val="18"/>
+              </w:rPr>
+              <w:t>$994</w:t>
+            </w:r>
+          </w:p>
+        </w:tc>
+        <w:tc>
+          <w:tcPr>
+            <w:tcW w:type="dxa" w:w="1440"/>
+            <w:shd w:val="clear" w:color="auto" w:fill="F2F4F8"/>
+          </w:tcPr>
+          <w:p>
+            <w:pPr>
+              <w:spacing w:after="0" w:before="0"/>
+              <w:jc w:val="right"/>
+            </w:pPr>
+            <w:r/>
+            <w:r>
+              <w:rPr>
+                <w:b w:val="0"/>
+                <w:i w:val="0"/>
+                <w:sz w:val="18"/>
+              </w:rPr>
+              <w:t>74%</w:t>
+            </w:r>
+          </w:p>
+        </w:tc>
+      </w:tr>
+      <w:tr>
+        <w:tc>
+          <w:tcPr>
+            <w:tcW w:type="dxa" w:w="3312"/>
+          </w:tcPr>
+          <w:p>
+            <w:pPr>
+              <w:spacing w:after="0" w:before="0"/>
+            </w:pPr>
+            <w:r/>
+            <w:r>
+              <w:rPr>
+                <w:b w:val="0"/>
+                <w:i w:val="0"/>
+                <w:sz w:val="18"/>
+              </w:rPr>
+              <w:t>One index per layer, Hyde Park weights</w:t>
+            </w:r>
+          </w:p>
+        </w:tc>
+        <w:tc>
+          <w:tcPr>
+            <w:tcW w:type="dxa" w:w="1440"/>
+          </w:tcPr>
+          <w:p>
+            <w:pPr>
+              <w:spacing w:after="0" w:before="0"/>
+              <w:jc w:val="right"/>
+            </w:pPr>
+            <w:r/>
+            <w:r>
+              <w:rPr>
+                <w:b w:val="0"/>
+                <w:i w:val="0"/>
+                <w:sz w:val="18"/>
+              </w:rPr>
+              <w:t>$832</w:t>
+            </w:r>
+          </w:p>
+        </w:tc>
+        <w:tc>
+          <w:tcPr>
+            <w:tcW w:type="dxa" w:w="1440"/>
+          </w:tcPr>
+          <w:p>
+            <w:pPr>
+              <w:spacing w:after="0" w:before="0"/>
+              <w:jc w:val="right"/>
+            </w:pPr>
+            <w:r/>
+            <w:r>
+              <w:rPr>
+                <w:b w:val="0"/>
+                <w:i w:val="0"/>
+                <w:sz w:val="18"/>
+              </w:rPr>
+              <w:t>51%</w:t>
+            </w:r>
+          </w:p>
+        </w:tc>
+        <w:tc>
+          <w:tcPr>
+            <w:tcW w:type="dxa" w:w="1584"/>
+          </w:tcPr>
+          <w:p>
+            <w:pPr>
+              <w:spacing w:after="0" w:before="0"/>
+              <w:jc w:val="right"/>
+            </w:pPr>
+            <w:r/>
+            <w:r>
+              <w:rPr>
+                <w:b w:val="0"/>
+                <w:i w:val="0"/>
+                <w:sz w:val="18"/>
+              </w:rPr>
+              <w:t>85%</w:t>
+            </w:r>
+          </w:p>
+        </w:tc>
+        <w:tc>
+          <w:tcPr>
+            <w:tcW w:type="dxa" w:w="1440"/>
+          </w:tcPr>
+          <w:p>
+            <w:pPr>
+              <w:spacing w:after="0" w:before="0"/>
+              <w:jc w:val="right"/>
+            </w:pPr>
+            <w:r/>
+            <w:r>
+              <w:rPr>
+                <w:b w:val="0"/>
+                <w:i w:val="0"/>
+                <w:sz w:val="18"/>
+              </w:rPr>
+              <w:t>$1,055</w:t>
+            </w:r>
+          </w:p>
+        </w:tc>
+        <w:tc>
+          <w:tcPr>
+            <w:tcW w:type="dxa" w:w="1440"/>
+          </w:tcPr>
+          <w:p>
+            <w:pPr>
+              <w:spacing w:after="0" w:before="0"/>
+              <w:jc w:val="right"/>
+            </w:pPr>
+            <w:r/>
+            <w:r>
+              <w:rPr>
+                <w:b w:val="0"/>
+                <w:i w:val="0"/>
+                <w:sz w:val="18"/>
+              </w:rPr>
+              <w:t>74%</w:t>
+            </w:r>
+          </w:p>
+        </w:tc>
+      </w:tr>
+      <w:tr>
+        <w:tc>
+          <w:tcPr>
+            <w:tcW w:type="dxa" w:w="3312"/>
+            <w:shd w:val="clear" w:color="auto" w:fill="F2F4F8"/>
+          </w:tcPr>
+          <w:p>
+            <w:pPr>
+              <w:spacing w:after="0" w:before="0"/>
+            </w:pPr>
+            <w:r/>
+            <w:r>
+              <w:rPr>
+                <w:b w:val="0"/>
+                <w:i w:val="0"/>
+                <w:sz w:val="18"/>
+              </w:rPr>
+              <w:t>Layer method, BNEF pack for the battery</w:t>
+            </w:r>
+          </w:p>
+        </w:tc>
+        <w:tc>
+          <w:tcPr>
+            <w:tcW w:type="dxa" w:w="1440"/>
+            <w:shd w:val="clear" w:color="auto" w:fill="F2F4F8"/>
+          </w:tcPr>
+          <w:p>
+            <w:pPr>
+              <w:spacing w:after="0" w:before="0"/>
+              <w:jc w:val="right"/>
+            </w:pPr>
+            <w:r/>
+            <w:r>
+              <w:rPr>
+                <w:b w:val="0"/>
+                <w:i w:val="0"/>
+                <w:sz w:val="18"/>
+              </w:rPr>
+              <w:t>$829</w:t>
+            </w:r>
+          </w:p>
+        </w:tc>
+        <w:tc>
+          <w:tcPr>
+            <w:tcW w:type="dxa" w:w="1440"/>
+            <w:shd w:val="clear" w:color="auto" w:fill="F2F4F8"/>
+          </w:tcPr>
+          <w:p>
+            <w:pPr>
+              <w:spacing w:after="0" w:before="0"/>
+              <w:jc w:val="right"/>
+            </w:pPr>
+            <w:r/>
+            <w:r>
+              <w:rPr>
+                <w:b w:val="0"/>
+                <w:i w:val="0"/>
+                <w:sz w:val="18"/>
+              </w:rPr>
+              <w:t>55%</w:t>
+            </w:r>
+          </w:p>
+        </w:tc>
+        <w:tc>
+          <w:tcPr>
+            <w:tcW w:type="dxa" w:w="1584"/>
+            <w:shd w:val="clear" w:color="auto" w:fill="F2F4F8"/>
+          </w:tcPr>
+          <w:p>
+            <w:pPr>
+              <w:spacing w:after="0" w:before="0"/>
+              <w:jc w:val="right"/>
+            </w:pPr>
+            <w:r/>
+            <w:r>
+              <w:rPr>
+                <w:b w:val="0"/>
+                <w:i w:val="0"/>
+                <w:sz w:val="18"/>
+              </w:rPr>
+              <w:t>87%</w:t>
+            </w:r>
+          </w:p>
+        </w:tc>
+        <w:tc>
+          <w:tcPr>
+            <w:tcW w:type="dxa" w:w="1440"/>
+            <w:shd w:val="clear" w:color="auto" w:fill="F2F4F8"/>
+          </w:tcPr>
+          <w:p>
+            <w:pPr>
+              <w:spacing w:after="0" w:before="0"/>
+              <w:jc w:val="right"/>
+            </w:pPr>
+            <w:r/>
+            <w:r>
+              <w:rPr>
+                <w:b w:val="0"/>
+                <w:i w:val="0"/>
+                <w:sz w:val="18"/>
+              </w:rPr>
+              <w:t>$1,034</w:t>
+            </w:r>
+          </w:p>
+        </w:tc>
+        <w:tc>
+          <w:tcPr>
+            <w:tcW w:type="dxa" w:w="1440"/>
+            <w:shd w:val="clear" w:color="auto" w:fill="F2F4F8"/>
+          </w:tcPr>
+          <w:p>
+            <w:pPr>
+              <w:spacing w:after="0" w:before="0"/>
+              <w:jc w:val="right"/>
+            </w:pPr>
+            <w:r/>
+            <w:r>
+              <w:rPr>
+                <w:b w:val="0"/>
+                <w:i w:val="0"/>
+                <w:sz w:val="18"/>
+              </w:rPr>
+              <w:t>77%</w:t>
+            </w:r>
+          </w:p>
+        </w:tc>
+      </w:tr>
+      <w:tr>
+        <w:tc>
+          <w:tcPr>
+            <w:tcW w:type="dxa" w:w="3312"/>
+          </w:tcPr>
+          <w:p>
+            <w:pPr>
+              <w:spacing w:after="0" w:before="0"/>
+            </w:pPr>
+            <w:r/>
+            <w:r>
+              <w:rPr>
+                <w:b w:val="0"/>
+                <w:i w:val="0"/>
+                <w:sz w:val="18"/>
+              </w:rPr>
+              <w:t>Layer method, BNEF turnkey for the battery</w:t>
+            </w:r>
+          </w:p>
+        </w:tc>
+        <w:tc>
+          <w:tcPr>
+            <w:tcW w:type="dxa" w:w="1440"/>
+          </w:tcPr>
+          <w:p>
+            <w:pPr>
+              <w:spacing w:after="0" w:before="0"/>
+              <w:jc w:val="right"/>
+            </w:pPr>
+            <w:r/>
+            <w:r>
+              <w:rPr>
+                <w:b w:val="0"/>
+                <w:i w:val="0"/>
+                <w:sz w:val="18"/>
+              </w:rPr>
+              <w:t>$778</w:t>
+            </w:r>
+          </w:p>
+        </w:tc>
+        <w:tc>
+          <w:tcPr>
+            <w:tcW w:type="dxa" w:w="1440"/>
+          </w:tcPr>
+          <w:p>
+            <w:pPr>
+              <w:spacing w:after="0" w:before="0"/>
+              <w:jc w:val="right"/>
+            </w:pPr>
+            <w:r/>
+            <w:r>
+              <w:rPr>
+                <w:b w:val="0"/>
+                <w:i w:val="0"/>
+                <w:sz w:val="18"/>
+              </w:rPr>
+              <w:t>60%</w:t>
+            </w:r>
+          </w:p>
+        </w:tc>
+        <w:tc>
+          <w:tcPr>
+            <w:tcW w:type="dxa" w:w="1584"/>
+          </w:tcPr>
+          <w:p>
+            <w:pPr>
+              <w:spacing w:after="0" w:before="0"/>
+              <w:jc w:val="right"/>
+            </w:pPr>
+            <w:r/>
+            <w:r>
+              <w:rPr>
+                <w:b w:val="0"/>
+                <w:i w:val="0"/>
+                <w:sz w:val="18"/>
+              </w:rPr>
+              <w:t>89%</w:t>
+            </w:r>
+          </w:p>
+        </w:tc>
+        <w:tc>
+          <w:tcPr>
+            <w:tcW w:type="dxa" w:w="1440"/>
+          </w:tcPr>
+          <w:p>
+            <w:pPr>
+              <w:spacing w:after="0" w:before="0"/>
+              <w:jc w:val="right"/>
+            </w:pPr>
+            <w:r/>
+            <w:r>
+              <w:rPr>
+                <w:b w:val="0"/>
+                <w:i w:val="0"/>
+                <w:sz w:val="18"/>
+              </w:rPr>
+              <w:t>$986</w:t>
+            </w:r>
+          </w:p>
+        </w:tc>
+        <w:tc>
+          <w:tcPr>
+            <w:tcW w:type="dxa" w:w="1440"/>
+          </w:tcPr>
+          <w:p>
+            <w:pPr>
+              <w:spacing w:after="0" w:before="0"/>
+              <w:jc w:val="right"/>
+            </w:pPr>
+            <w:r/>
+            <w:r>
+              <w:rPr>
+                <w:b w:val="0"/>
+                <w:i w:val="0"/>
+                <w:sz w:val="18"/>
+              </w:rPr>
+              <w:t>81%</w:t>
+            </w:r>
+          </w:p>
+        </w:tc>
+      </w:tr>
+    </w:tbl>
+    <w:p>
+      <w:pPr>
+        <w:spacing w:after="40"/>
+      </w:pPr>
+    </w:p>
+    <w:p>
+      <w:pPr>
+        <w:spacing w:after="120"/>
+      </w:pPr>
+      <w:r>
+        <w:rPr>
+          <w:b w:val="0"/>
+          <w:i w:val="0"/>
+        </w:rPr>
+        <w:t>Applied to the 55-project class with a merchant-project composition (battery 45 percent, power conversion and balance of system 15, labor 10, soft costs 12, interconnection 8, transformers 5, civil 5) the layer method gives a median of $832, the two-component model $832, and Hyde Park's station-direct cost sits at the 85% percentile under both. Substituting the BNEF pack or turnkey series for the battery moves the median to $829 and $778. The three defensible methods therefore agree within a few dollars; the one that disagrees is the one that cannot be defended. What governs the answer is the battery share of each comparable, which no disclosure states, and the memo carries 30 and 50 percent as sensitivities.</w:t>
+      </w:r>
+    </w:p>
+    <w:tbl>
+      <w:tblPr>
+        <w:tblStyle w:val="TableGrid"/>
+        <w:tblW w:type="auto" w:w="0"/>
+        <w:tblLook w:firstColumn="1" w:firstRow="1" w:lastColumn="0" w:lastRow="0" w:noHBand="0" w:noVBand="1" w:val="04A0"/>
+      </w:tblPr>
+      <w:tblGrid>
+        <w:gridCol w:w="9360"/>
+      </w:tblGrid>
+      <w:tr>
+        <w:tc>
+          <w:tcPr>
+            <w:tcW w:type="dxa" w:w="9360"/>
+            <w:shd w:val="clear" w:color="auto" w:fill="E8EDF5"/>
+          </w:tcPr>
+          <w:p>
+            <w:pPr>
+              <w:spacing w:after="40"/>
+            </w:pPr>
+            <w:r/>
+            <w:r>
+              <w:rPr>
+                <w:b/>
+                <w:color w:val="001E60"/>
+                <w:sz w:val="20"/>
+              </w:rPr>
+              <w:t xml:space="preserve">How to scale any published BESS cost to 2026. </w:t>
+            </w:r>
+            <w:r>
+              <w:rPr>
+                <w:sz w:val="20"/>
+              </w:rPr>
+              <w:t>Fix the dollar year and the scope boundary (contract, installed, station, all-in; real or nominal). Split the cost into a battery share and a non-battery share from the scope, not from a default: about 40 percent for an all-in utility project, 55 percent or more for a turnkey quote. Deflate the battery share on a battery index and escalate the rest on a construction or layer index. Never apply one index to the whole cost. The companion workbook's '2026$ Adjustment' and 'Layer Escalators' tabs do this with an index selector.</w:t>
+            </w:r>
+          </w:p>
+        </w:tc>
+      </w:tr>
+    </w:tbl>
+    <w:p>
+      <w:pPr>
+        <w:spacing w:after="40"/>
+      </w:pPr>
+    </w:p>
+    <w:p>
+      <w:pPr>
+        <w:spacing w:after="120"/>
+      </w:pPr>
+      <w:r>
+        <w:rPr>
+          <w:b w:val="0"/>
+          <w:i w:val="0"/>
+          <w:color w:val="595959"/>
+          <w:sz w:val="18"/>
+        </w:rPr>
+        <w:t>Series: BLS producer price indices (WPU117409 transformers, WPU1175 switchgear, WPU4532 engineering services) and the Employment Cost Index for construction pulled from the FRED and BLS APIs on 3 October 2026, annual averages, the latest year a partial-year average; IBEW Local 103 journeyman base rates from the Massachusetts prevailing-wage schedules and the Boston JATC rate sheets; ENR Construction Cost Index 20-city annual averages from published reproductions of the ENR table (2019 to 2022 interpolated); Handy-Whitman North Atlantic lines from the PJM posting and the Cost Estimating CoE's own extraction of Bulletin 198; battery indices as in the statistical memo. Confidence tags per series are in the build folder.</w:t>
+      </w:r>
+    </w:p>
+    <w:p>
+      <w:pPr>
         <w:pStyle w:val="Heading1"/>
       </w:pPr>
       <w:r>
@@ -8236,7 +10290,2580 @@
         <w:pStyle w:val="Heading1"/>
       </w:pPr>
       <w:r>
-        <w:t>8. Recommendations</w:t>
+        <w:t>8. Where the number could give: the savings register</w:t>
+      </w:r>
+    </w:p>
+    <w:p>
+      <w:pPr>
+        <w:spacing w:after="120"/>
+      </w:pPr>
+      <w:r>
+        <w:rPr>
+          <w:b w:val="0"/>
+          <w:i w:val="0"/>
+        </w:rPr>
+        <w:t>The layer extraction also answers the question leadership asks after the benchmark question: what can be done about it. Fourteen levers were sized from the Rev 3 rows on 3 October 2026 and grouped by what it takes to realize them. Tier A changes the estimate without changing scope and needs only decisions. Tier B is value engineering that needs a study or a design decision first. Tier C is financial and structural: it reduces what customers pay for the project, not the $57.2 million. Direct dollars are the rows; loaded dollars apply the marginal loader of 1.44 (contingency, basis-driven indirects and AFUDC scale with directs; the risk register and the indirect rows already booked as actuals do not), not the 1.685 average loader used elsewhere in this paper.</w:t>
+      </w:r>
+    </w:p>
+    <w:tbl>
+      <w:tblPr>
+        <w:tblStyle w:val="TableGrid"/>
+        <w:tblW w:type="auto" w:w="0"/>
+        <w:jc w:val="center"/>
+        <w:tblLayout w:type="fixed"/>
+        <w:tblLook w:firstColumn="1" w:firstRow="1" w:lastColumn="0" w:lastRow="0" w:noHBand="0" w:noVBand="1" w:val="04A0"/>
+      </w:tblPr>
+      <w:tblGrid>
+        <w:gridCol w:w="504"/>
+        <w:gridCol w:w="3744"/>
+        <w:gridCol w:w="720"/>
+        <w:gridCol w:w="1224"/>
+        <w:gridCol w:w="1224"/>
+        <w:gridCol w:w="1008"/>
+        <w:gridCol w:w="3168"/>
+      </w:tblGrid>
+      <w:tr>
+        <w:tc>
+          <w:tcPr>
+            <w:tcW w:type="dxa" w:w="504"/>
+            <w:shd w:val="clear" w:color="auto" w:fill="001E60"/>
+          </w:tcPr>
+          <w:p>
+            <w:pPr>
+              <w:spacing w:after="0" w:before="0"/>
+            </w:pPr>
+            <w:r/>
+            <w:r>
+              <w:rPr>
+                <w:b/>
+                <w:i w:val="0"/>
+                <w:color w:val="FFFFFF"/>
+                <w:sz w:val="16"/>
+              </w:rPr>
+              <w:t>#</w:t>
+            </w:r>
+          </w:p>
+        </w:tc>
+        <w:tc>
+          <w:tcPr>
+            <w:tcW w:type="dxa" w:w="3744"/>
+            <w:shd w:val="clear" w:color="auto" w:fill="001E60"/>
+          </w:tcPr>
+          <w:p>
+            <w:pPr>
+              <w:spacing w:after="0" w:before="0"/>
+            </w:pPr>
+            <w:r/>
+            <w:r>
+              <w:rPr>
+                <w:b/>
+                <w:i w:val="0"/>
+                <w:color w:val="FFFFFF"/>
+                <w:sz w:val="16"/>
+              </w:rPr>
+              <w:t>Lever</w:t>
+            </w:r>
+          </w:p>
+        </w:tc>
+        <w:tc>
+          <w:tcPr>
+            <w:tcW w:type="dxa" w:w="720"/>
+            <w:shd w:val="clear" w:color="auto" w:fill="001E60"/>
+          </w:tcPr>
+          <w:p>
+            <w:pPr>
+              <w:spacing w:after="0" w:before="0"/>
+            </w:pPr>
+            <w:r/>
+            <w:r>
+              <w:rPr>
+                <w:b/>
+                <w:i w:val="0"/>
+                <w:color w:val="FFFFFF"/>
+                <w:sz w:val="16"/>
+              </w:rPr>
+              <w:t>Layer</w:t>
+            </w:r>
+          </w:p>
+        </w:tc>
+        <w:tc>
+          <w:tcPr>
+            <w:tcW w:type="dxa" w:w="1224"/>
+            <w:shd w:val="clear" w:color="auto" w:fill="001E60"/>
+          </w:tcPr>
+          <w:p>
+            <w:pPr>
+              <w:spacing w:after="0" w:before="0"/>
+            </w:pPr>
+            <w:r/>
+            <w:r>
+              <w:rPr>
+                <w:b/>
+                <w:i w:val="0"/>
+                <w:color w:val="FFFFFF"/>
+                <w:sz w:val="16"/>
+              </w:rPr>
+              <w:t>Direct</w:t>
+            </w:r>
+          </w:p>
+        </w:tc>
+        <w:tc>
+          <w:tcPr>
+            <w:tcW w:type="dxa" w:w="1224"/>
+            <w:shd w:val="clear" w:color="auto" w:fill="001E60"/>
+          </w:tcPr>
+          <w:p>
+            <w:pPr>
+              <w:spacing w:after="0" w:before="0"/>
+            </w:pPr>
+            <w:r/>
+            <w:r>
+              <w:rPr>
+                <w:b/>
+                <w:i w:val="0"/>
+                <w:color w:val="FFFFFF"/>
+                <w:sz w:val="16"/>
+              </w:rPr>
+              <w:t>Loaded</w:t>
+            </w:r>
+          </w:p>
+        </w:tc>
+        <w:tc>
+          <w:tcPr>
+            <w:tcW w:type="dxa" w:w="1008"/>
+            <w:shd w:val="clear" w:color="auto" w:fill="001E60"/>
+          </w:tcPr>
+          <w:p>
+            <w:pPr>
+              <w:spacing w:after="0" w:before="0"/>
+            </w:pPr>
+            <w:r/>
+            <w:r>
+              <w:rPr>
+                <w:b/>
+                <w:i w:val="0"/>
+                <w:color w:val="FFFFFF"/>
+                <w:sz w:val="16"/>
+              </w:rPr>
+              <w:t>Confidence</w:t>
+            </w:r>
+          </w:p>
+        </w:tc>
+        <w:tc>
+          <w:tcPr>
+            <w:tcW w:type="dxa" w:w="3168"/>
+            <w:shd w:val="clear" w:color="auto" w:fill="001E60"/>
+          </w:tcPr>
+          <w:p>
+            <w:pPr>
+              <w:spacing w:after="0" w:before="0"/>
+            </w:pPr>
+            <w:r/>
+            <w:r>
+              <w:rPr>
+                <w:b/>
+                <w:i w:val="0"/>
+                <w:color w:val="FFFFFF"/>
+                <w:sz w:val="16"/>
+              </w:rPr>
+              <w:t>What must close</w:t>
+            </w:r>
+          </w:p>
+        </w:tc>
+      </w:tr>
+      <w:tr>
+        <w:tc>
+          <w:tcPr>
+            <w:tcW w:type="dxa" w:w="504"/>
+          </w:tcPr>
+          <w:p>
+            <w:pPr>
+              <w:spacing w:after="0" w:before="0"/>
+            </w:pPr>
+            <w:r/>
+            <w:r>
+              <w:rPr>
+                <w:b w:val="0"/>
+                <w:i w:val="0"/>
+                <w:sz w:val="16"/>
+              </w:rPr>
+              <w:t>A1</w:t>
+            </w:r>
+          </w:p>
+        </w:tc>
+        <w:tc>
+          <w:tcPr>
+            <w:tcW w:type="dxa" w:w="3744"/>
+          </w:tcPr>
+          <w:p>
+            <w:pPr>
+              <w:spacing w:after="0" w:before="0"/>
+            </w:pPr>
+            <w:r/>
+            <w:r>
+              <w:rPr>
+                <w:b w:val="0"/>
+                <w:i w:val="0"/>
+                <w:sz w:val="16"/>
+              </w:rPr>
+              <w:t>Remove escalation carried on the fixed-price Nomad balance</w:t>
+            </w:r>
+          </w:p>
+        </w:tc>
+        <w:tc>
+          <w:tcPr>
+            <w:tcW w:type="dxa" w:w="720"/>
+          </w:tcPr>
+          <w:p>
+            <w:pPr>
+              <w:spacing w:after="0" w:before="0"/>
+            </w:pPr>
+            <w:r/>
+            <w:r>
+              <w:rPr>
+                <w:b w:val="0"/>
+                <w:i w:val="0"/>
+                <w:sz w:val="16"/>
+              </w:rPr>
+              <w:t>A</w:t>
+            </w:r>
+          </w:p>
+        </w:tc>
+        <w:tc>
+          <w:tcPr>
+            <w:tcW w:type="dxa" w:w="1224"/>
+          </w:tcPr>
+          <w:p>
+            <w:pPr>
+              <w:spacing w:after="0" w:before="0"/>
+              <w:jc w:val="right"/>
+            </w:pPr>
+            <w:r/>
+            <w:r>
+              <w:rPr>
+                <w:b w:val="0"/>
+                <w:i w:val="0"/>
+                <w:sz w:val="16"/>
+              </w:rPr>
+              <w:t>$1.1M</w:t>
+            </w:r>
+          </w:p>
+        </w:tc>
+        <w:tc>
+          <w:tcPr>
+            <w:tcW w:type="dxa" w:w="1224"/>
+          </w:tcPr>
+          <w:p>
+            <w:pPr>
+              <w:spacing w:after="0" w:before="0"/>
+              <w:jc w:val="right"/>
+            </w:pPr>
+            <w:r/>
+            <w:r>
+              <w:rPr>
+                <w:b w:val="0"/>
+                <w:i w:val="0"/>
+                <w:sz w:val="16"/>
+              </w:rPr>
+              <w:t>$1.6M</w:t>
+            </w:r>
+          </w:p>
+        </w:tc>
+        <w:tc>
+          <w:tcPr>
+            <w:tcW w:type="dxa" w:w="1008"/>
+          </w:tcPr>
+          <w:p>
+            <w:pPr>
+              <w:spacing w:after="0" w:before="0"/>
+            </w:pPr>
+            <w:r/>
+            <w:r>
+              <w:rPr>
+                <w:b w:val="0"/>
+                <w:i w:val="0"/>
+                <w:sz w:val="16"/>
+              </w:rPr>
+              <w:t>High</w:t>
+            </w:r>
+          </w:p>
+        </w:tc>
+        <w:tc>
+          <w:tcPr>
+            <w:tcW w:type="dxa" w:w="3168"/>
+          </w:tcPr>
+          <w:p>
+            <w:pPr>
+              <w:spacing w:after="0" w:before="0"/>
+            </w:pPr>
+            <w:r/>
+            <w:r>
+              <w:rPr>
+                <w:b w:val="0"/>
+                <w:i w:val="0"/>
+                <w:sz w:val="16"/>
+              </w:rPr>
+              <w:t>Exhibit C read for tariff and change-in-law pass-through; decision minuted</w:t>
+            </w:r>
+          </w:p>
+        </w:tc>
+      </w:tr>
+      <w:tr>
+        <w:tc>
+          <w:tcPr>
+            <w:tcW w:type="dxa" w:w="504"/>
+            <w:shd w:val="clear" w:color="auto" w:fill="F2F4F8"/>
+          </w:tcPr>
+          <w:p>
+            <w:pPr>
+              <w:spacing w:after="0" w:before="0"/>
+            </w:pPr>
+            <w:r/>
+            <w:r>
+              <w:rPr>
+                <w:b w:val="0"/>
+                <w:i w:val="0"/>
+                <w:sz w:val="16"/>
+              </w:rPr>
+              <w:t>A2</w:t>
+            </w:r>
+          </w:p>
+        </w:tc>
+        <w:tc>
+          <w:tcPr>
+            <w:tcW w:type="dxa" w:w="3744"/>
+            <w:shd w:val="clear" w:color="auto" w:fill="F2F4F8"/>
+          </w:tcPr>
+          <w:p>
+            <w:pPr>
+              <w:spacing w:after="0" w:before="0"/>
+            </w:pPr>
+            <w:r/>
+            <w:r>
+              <w:rPr>
+                <w:b w:val="0"/>
+                <w:i w:val="0"/>
+                <w:sz w:val="16"/>
+              </w:rPr>
+              <w:t>Risk register: labor-cost and material-cost lines overlap the escalation already in the directs</w:t>
+            </w:r>
+          </w:p>
+        </w:tc>
+        <w:tc>
+          <w:tcPr>
+            <w:tcW w:type="dxa" w:w="720"/>
+            <w:shd w:val="clear" w:color="auto" w:fill="F2F4F8"/>
+          </w:tcPr>
+          <w:p>
+            <w:pPr>
+              <w:spacing w:after="0" w:before="0"/>
+            </w:pPr>
+            <w:r/>
+            <w:r>
+              <w:rPr>
+                <w:b w:val="0"/>
+                <w:i w:val="0"/>
+                <w:sz w:val="16"/>
+              </w:rPr>
+              <w:t>J</w:t>
+            </w:r>
+          </w:p>
+        </w:tc>
+        <w:tc>
+          <w:tcPr>
+            <w:tcW w:type="dxa" w:w="1224"/>
+            <w:shd w:val="clear" w:color="auto" w:fill="F2F4F8"/>
+          </w:tcPr>
+          <w:p>
+            <w:pPr>
+              <w:spacing w:after="0" w:before="0"/>
+              <w:jc w:val="right"/>
+            </w:pPr>
+            <w:r/>
+            <w:r>
+              <w:rPr>
+                <w:b w:val="0"/>
+                <w:i w:val="0"/>
+                <w:sz w:val="16"/>
+              </w:rPr>
+              <w:t>$1.3 to 1.8M</w:t>
+            </w:r>
+          </w:p>
+        </w:tc>
+        <w:tc>
+          <w:tcPr>
+            <w:tcW w:type="dxa" w:w="1224"/>
+            <w:shd w:val="clear" w:color="auto" w:fill="F2F4F8"/>
+          </w:tcPr>
+          <w:p>
+            <w:pPr>
+              <w:spacing w:after="0" w:before="0"/>
+              <w:jc w:val="right"/>
+            </w:pPr>
+            <w:r/>
+            <w:r>
+              <w:rPr>
+                <w:b w:val="0"/>
+                <w:i w:val="0"/>
+                <w:sz w:val="16"/>
+              </w:rPr>
+              <w:t>$1.3 to 1.8M</w:t>
+            </w:r>
+          </w:p>
+        </w:tc>
+        <w:tc>
+          <w:tcPr>
+            <w:tcW w:type="dxa" w:w="1008"/>
+            <w:shd w:val="clear" w:color="auto" w:fill="F2F4F8"/>
+          </w:tcPr>
+          <w:p>
+            <w:pPr>
+              <w:spacing w:after="0" w:before="0"/>
+            </w:pPr>
+            <w:r/>
+            <w:r>
+              <w:rPr>
+                <w:b w:val="0"/>
+                <w:i w:val="0"/>
+                <w:sz w:val="16"/>
+              </w:rPr>
+              <w:t>Medium</w:t>
+            </w:r>
+          </w:p>
+        </w:tc>
+        <w:tc>
+          <w:tcPr>
+            <w:tcW w:type="dxa" w:w="3168"/>
+            <w:shd w:val="clear" w:color="auto" w:fill="F2F4F8"/>
+          </w:tcPr>
+          <w:p>
+            <w:pPr>
+              <w:spacing w:after="0" w:before="0"/>
+            </w:pPr>
+            <w:r/>
+            <w:r>
+              <w:rPr>
+                <w:b w:val="0"/>
+                <w:i w:val="0"/>
+                <w:sz w:val="16"/>
+              </w:rPr>
+              <w:t>Re-word the two lines as labor-shortage and tariff risks and size them on exposure, not on the whole material and labor base</w:t>
+            </w:r>
+          </w:p>
+        </w:tc>
+      </w:tr>
+      <w:tr>
+        <w:tc>
+          <w:tcPr>
+            <w:tcW w:type="dxa" w:w="504"/>
+          </w:tcPr>
+          <w:p>
+            <w:pPr>
+              <w:spacing w:after="0" w:before="0"/>
+            </w:pPr>
+            <w:r/>
+            <w:r>
+              <w:rPr>
+                <w:b w:val="0"/>
+                <w:i w:val="0"/>
+                <w:sz w:val="16"/>
+              </w:rPr>
+              <w:t>A3</w:t>
+            </w:r>
+          </w:p>
+        </w:tc>
+        <w:tc>
+          <w:tcPr>
+            <w:tcW w:type="dxa" w:w="3744"/>
+          </w:tcPr>
+          <w:p>
+            <w:pPr>
+              <w:spacing w:after="0" w:before="0"/>
+            </w:pPr>
+            <w:r/>
+            <w:r>
+              <w:rPr>
+                <w:b w:val="0"/>
+                <w:i w:val="0"/>
+                <w:sz w:val="16"/>
+              </w:rPr>
+              <w:t>Confirm the four written design-basis items Haugland priced as deducts</w:t>
+            </w:r>
+          </w:p>
+        </w:tc>
+        <w:tc>
+          <w:tcPr>
+            <w:tcW w:type="dxa" w:w="720"/>
+          </w:tcPr>
+          <w:p>
+            <w:pPr>
+              <w:spacing w:after="0" w:before="0"/>
+            </w:pPr>
+            <w:r/>
+            <w:r>
+              <w:rPr>
+                <w:b w:val="0"/>
+                <w:i w:val="0"/>
+                <w:sz w:val="16"/>
+              </w:rPr>
+              <w:t>D/E</w:t>
+            </w:r>
+          </w:p>
+        </w:tc>
+        <w:tc>
+          <w:tcPr>
+            <w:tcW w:type="dxa" w:w="1224"/>
+          </w:tcPr>
+          <w:p>
+            <w:pPr>
+              <w:spacing w:after="0" w:before="0"/>
+              <w:jc w:val="right"/>
+            </w:pPr>
+            <w:r/>
+            <w:r>
+              <w:rPr>
+                <w:b w:val="0"/>
+                <w:i w:val="0"/>
+                <w:sz w:val="16"/>
+              </w:rPr>
+              <w:t>$0.6 to 0.8M</w:t>
+            </w:r>
+          </w:p>
+        </w:tc>
+        <w:tc>
+          <w:tcPr>
+            <w:tcW w:type="dxa" w:w="1224"/>
+          </w:tcPr>
+          <w:p>
+            <w:pPr>
+              <w:spacing w:after="0" w:before="0"/>
+              <w:jc w:val="right"/>
+            </w:pPr>
+            <w:r/>
+            <w:r>
+              <w:rPr>
+                <w:b w:val="0"/>
+                <w:i w:val="0"/>
+                <w:sz w:val="16"/>
+              </w:rPr>
+              <w:t>$0.9 to 1.2M</w:t>
+            </w:r>
+          </w:p>
+        </w:tc>
+        <w:tc>
+          <w:tcPr>
+            <w:tcW w:type="dxa" w:w="1008"/>
+          </w:tcPr>
+          <w:p>
+            <w:pPr>
+              <w:spacing w:after="0" w:before="0"/>
+            </w:pPr>
+            <w:r/>
+            <w:r>
+              <w:rPr>
+                <w:b w:val="0"/>
+                <w:i w:val="0"/>
+                <w:sz w:val="16"/>
+              </w:rPr>
+              <w:t>Medium</w:t>
+            </w:r>
+          </w:p>
+        </w:tc>
+        <w:tc>
+          <w:tcPr>
+            <w:tcW w:type="dxa" w:w="3168"/>
+          </w:tcPr>
+          <w:p>
+            <w:pPr>
+              <w:spacing w:after="0" w:before="0"/>
+            </w:pPr>
+            <w:r/>
+            <w:r>
+              <w:rPr>
+                <w:b w:val="0"/>
+                <w:i w:val="0"/>
+                <w:sz w:val="16"/>
+              </w:rPr>
+              <w:t>Retaining wall, basin, duct bank and GSU count confirmed in writing; HEG map signed first</w:t>
+            </w:r>
+          </w:p>
+        </w:tc>
+      </w:tr>
+      <w:tr>
+        <w:tc>
+          <w:tcPr>
+            <w:tcW w:type="dxa" w:w="504"/>
+            <w:shd w:val="clear" w:color="auto" w:fill="F2F4F8"/>
+          </w:tcPr>
+          <w:p>
+            <w:pPr>
+              <w:spacing w:after="0" w:before="0"/>
+            </w:pPr>
+            <w:r/>
+            <w:r>
+              <w:rPr>
+                <w:b w:val="0"/>
+                <w:i w:val="0"/>
+                <w:sz w:val="16"/>
+              </w:rPr>
+              <w:t>A4</w:t>
+            </w:r>
+          </w:p>
+        </w:tc>
+        <w:tc>
+          <w:tcPr>
+            <w:tcW w:type="dxa" w:w="3744"/>
+            <w:shd w:val="clear" w:color="auto" w:fill="F2F4F8"/>
+          </w:tcPr>
+          <w:p>
+            <w:pPr>
+              <w:spacing w:after="0" w:before="0"/>
+            </w:pPr>
+            <w:r/>
+            <w:r>
+              <w:rPr>
+                <w:b w:val="0"/>
+                <w:i w:val="0"/>
+                <w:sz w:val="16"/>
+              </w:rPr>
+              <w:t>Engineering &amp; supervision overhead basis applied to the vendor turnkey contract</w:t>
+            </w:r>
+          </w:p>
+        </w:tc>
+        <w:tc>
+          <w:tcPr>
+            <w:tcW w:type="dxa" w:w="720"/>
+            <w:shd w:val="clear" w:color="auto" w:fill="F2F4F8"/>
+          </w:tcPr>
+          <w:p>
+            <w:pPr>
+              <w:spacing w:after="0" w:before="0"/>
+            </w:pPr>
+            <w:r/>
+            <w:r>
+              <w:rPr>
+                <w:b w:val="0"/>
+                <w:i w:val="0"/>
+                <w:sz w:val="16"/>
+              </w:rPr>
+              <w:t>L</w:t>
+            </w:r>
+          </w:p>
+        </w:tc>
+        <w:tc>
+          <w:tcPr>
+            <w:tcW w:type="dxa" w:w="1224"/>
+            <w:shd w:val="clear" w:color="auto" w:fill="F2F4F8"/>
+          </w:tcPr>
+          <w:p>
+            <w:pPr>
+              <w:spacing w:after="0" w:before="0"/>
+              <w:jc w:val="right"/>
+            </w:pPr>
+            <w:r/>
+            <w:r>
+              <w:rPr>
+                <w:b w:val="0"/>
+                <w:i w:val="0"/>
+                <w:sz w:val="16"/>
+              </w:rPr>
+              <w:t>$1.0 to 2.1M</w:t>
+            </w:r>
+          </w:p>
+        </w:tc>
+        <w:tc>
+          <w:tcPr>
+            <w:tcW w:type="dxa" w:w="1224"/>
+            <w:shd w:val="clear" w:color="auto" w:fill="F2F4F8"/>
+          </w:tcPr>
+          <w:p>
+            <w:pPr>
+              <w:spacing w:after="0" w:before="0"/>
+              <w:jc w:val="right"/>
+            </w:pPr>
+            <w:r/>
+            <w:r>
+              <w:rPr>
+                <w:b w:val="0"/>
+                <w:i w:val="0"/>
+                <w:sz w:val="16"/>
+              </w:rPr>
+              <w:t>$1.0 to 2.1M</w:t>
+            </w:r>
+          </w:p>
+        </w:tc>
+        <w:tc>
+          <w:tcPr>
+            <w:tcW w:type="dxa" w:w="1008"/>
+            <w:shd w:val="clear" w:color="auto" w:fill="F2F4F8"/>
+          </w:tcPr>
+          <w:p>
+            <w:pPr>
+              <w:spacing w:after="0" w:before="0"/>
+            </w:pPr>
+            <w:r/>
+            <w:r>
+              <w:rPr>
+                <w:b w:val="0"/>
+                <w:i w:val="0"/>
+                <w:sz w:val="16"/>
+              </w:rPr>
+              <w:t>Low</w:t>
+            </w:r>
+          </w:p>
+        </w:tc>
+        <w:tc>
+          <w:tcPr>
+            <w:tcW w:type="dxa" w:w="3168"/>
+            <w:shd w:val="clear" w:color="auto" w:fill="F2F4F8"/>
+          </w:tcPr>
+          <w:p>
+            <w:pPr>
+              <w:spacing w:after="0" w:before="0"/>
+            </w:pPr>
+            <w:r/>
+            <w:r>
+              <w:rPr>
+                <w:b w:val="0"/>
+                <w:i w:val="0"/>
+                <w:sz w:val="16"/>
+              </w:rPr>
+              <w:t>Ruling on whether the E&amp;S station basis applies to vendor-furnished, vendor-commissioned equipment</w:t>
+            </w:r>
+          </w:p>
+        </w:tc>
+      </w:tr>
+      <w:tr>
+        <w:tc>
+          <w:tcPr>
+            <w:tcW w:type="dxa" w:w="504"/>
+          </w:tcPr>
+          <w:p>
+            <w:pPr>
+              <w:spacing w:after="0" w:before="0"/>
+            </w:pPr>
+            <w:r/>
+            <w:r>
+              <w:rPr>
+                <w:b w:val="0"/>
+                <w:i w:val="0"/>
+                <w:sz w:val="16"/>
+              </w:rPr>
+              <w:t>A5</w:t>
+            </w:r>
+          </w:p>
+        </w:tc>
+        <w:tc>
+          <w:tcPr>
+            <w:tcW w:type="dxa" w:w="3744"/>
+          </w:tcPr>
+          <w:p>
+            <w:pPr>
+              <w:spacing w:after="0" w:before="0"/>
+            </w:pPr>
+            <w:r/>
+            <w:r>
+              <w:rPr>
+                <w:b w:val="0"/>
+                <w:i w:val="0"/>
+                <w:sz w:val="16"/>
+              </w:rPr>
+              <w:t>Commissioning hours carried from E-23-373 overlap Nomad's commissioning support</w:t>
+            </w:r>
+          </w:p>
+        </w:tc>
+        <w:tc>
+          <w:tcPr>
+            <w:tcW w:type="dxa" w:w="720"/>
+          </w:tcPr>
+          <w:p>
+            <w:pPr>
+              <w:spacing w:after="0" w:before="0"/>
+            </w:pPr>
+            <w:r/>
+            <w:r>
+              <w:rPr>
+                <w:b w:val="0"/>
+                <w:i w:val="0"/>
+                <w:sz w:val="16"/>
+              </w:rPr>
+              <w:t>G</w:t>
+            </w:r>
+          </w:p>
+        </w:tc>
+        <w:tc>
+          <w:tcPr>
+            <w:tcW w:type="dxa" w:w="1224"/>
+          </w:tcPr>
+          <w:p>
+            <w:pPr>
+              <w:spacing w:after="0" w:before="0"/>
+              <w:jc w:val="right"/>
+            </w:pPr>
+            <w:r/>
+            <w:r>
+              <w:rPr>
+                <w:b w:val="0"/>
+                <w:i w:val="0"/>
+                <w:sz w:val="16"/>
+              </w:rPr>
+              <w:t>$0.1 to 0.3M</w:t>
+            </w:r>
+          </w:p>
+        </w:tc>
+        <w:tc>
+          <w:tcPr>
+            <w:tcW w:type="dxa" w:w="1224"/>
+          </w:tcPr>
+          <w:p>
+            <w:pPr>
+              <w:spacing w:after="0" w:before="0"/>
+              <w:jc w:val="right"/>
+            </w:pPr>
+            <w:r/>
+            <w:r>
+              <w:rPr>
+                <w:b w:val="0"/>
+                <w:i w:val="0"/>
+                <w:sz w:val="16"/>
+              </w:rPr>
+              <w:t>$0.2 to 0.5M</w:t>
+            </w:r>
+          </w:p>
+        </w:tc>
+        <w:tc>
+          <w:tcPr>
+            <w:tcW w:type="dxa" w:w="1008"/>
+          </w:tcPr>
+          <w:p>
+            <w:pPr>
+              <w:spacing w:after="0" w:before="0"/>
+            </w:pPr>
+            <w:r/>
+            <w:r>
+              <w:rPr>
+                <w:b w:val="0"/>
+                <w:i w:val="0"/>
+                <w:sz w:val="16"/>
+              </w:rPr>
+              <w:t>Low</w:t>
+            </w:r>
+          </w:p>
+        </w:tc>
+        <w:tc>
+          <w:tcPr>
+            <w:tcW w:type="dxa" w:w="3168"/>
+          </w:tcPr>
+          <w:p>
+            <w:pPr>
+              <w:spacing w:after="0" w:before="0"/>
+            </w:pPr>
+            <w:r/>
+            <w:r>
+              <w:rPr>
+                <w:b w:val="0"/>
+                <w:i w:val="0"/>
+                <w:sz w:val="16"/>
+              </w:rPr>
+              <w:t>Commissioning split (Nomad vs owner) written into the test plan</w:t>
+            </w:r>
+          </w:p>
+        </w:tc>
+      </w:tr>
+      <w:tr>
+        <w:tc>
+          <w:tcPr>
+            <w:tcW w:type="dxa" w:w="504"/>
+            <w:shd w:val="clear" w:color="auto" w:fill="F2F4F8"/>
+          </w:tcPr>
+          <w:p>
+            <w:pPr>
+              <w:spacing w:after="0" w:before="0"/>
+            </w:pPr>
+            <w:r/>
+            <w:r>
+              <w:rPr>
+                <w:b w:val="0"/>
+                <w:i w:val="0"/>
+                <w:sz w:val="16"/>
+              </w:rPr>
+              <w:t>B1</w:t>
+            </w:r>
+          </w:p>
+        </w:tc>
+        <w:tc>
+          <w:tcPr>
+            <w:tcW w:type="dxa" w:w="3744"/>
+            <w:shd w:val="clear" w:color="auto" w:fill="F2F4F8"/>
+          </w:tcPr>
+          <w:p>
+            <w:pPr>
+              <w:spacing w:after="0" w:before="0"/>
+            </w:pPr>
+            <w:r/>
+            <w:r>
+              <w:rPr>
+                <w:b w:val="0"/>
+                <w:i w:val="0"/>
+                <w:sz w:val="16"/>
+              </w:rPr>
+              <w:t>Station 496 relay program: 710 man-hours per relay</w:t>
+            </w:r>
+          </w:p>
+        </w:tc>
+        <w:tc>
+          <w:tcPr>
+            <w:tcW w:type="dxa" w:w="720"/>
+            <w:shd w:val="clear" w:color="auto" w:fill="F2F4F8"/>
+          </w:tcPr>
+          <w:p>
+            <w:pPr>
+              <w:spacing w:after="0" w:before="0"/>
+            </w:pPr>
+            <w:r/>
+            <w:r>
+              <w:rPr>
+                <w:b w:val="0"/>
+                <w:i w:val="0"/>
+                <w:sz w:val="16"/>
+              </w:rPr>
+              <w:t>F</w:t>
+            </w:r>
+          </w:p>
+        </w:tc>
+        <w:tc>
+          <w:tcPr>
+            <w:tcW w:type="dxa" w:w="1224"/>
+            <w:shd w:val="clear" w:color="auto" w:fill="F2F4F8"/>
+          </w:tcPr>
+          <w:p>
+            <w:pPr>
+              <w:spacing w:after="0" w:before="0"/>
+              <w:jc w:val="right"/>
+            </w:pPr>
+            <w:r/>
+            <w:r>
+              <w:rPr>
+                <w:b w:val="0"/>
+                <w:i w:val="0"/>
+                <w:sz w:val="16"/>
+              </w:rPr>
+              <w:t>$1.1 to 1.5M</w:t>
+            </w:r>
+          </w:p>
+        </w:tc>
+        <w:tc>
+          <w:tcPr>
+            <w:tcW w:type="dxa" w:w="1224"/>
+            <w:shd w:val="clear" w:color="auto" w:fill="F2F4F8"/>
+          </w:tcPr>
+          <w:p>
+            <w:pPr>
+              <w:spacing w:after="0" w:before="0"/>
+              <w:jc w:val="right"/>
+            </w:pPr>
+            <w:r/>
+            <w:r>
+              <w:rPr>
+                <w:b w:val="0"/>
+                <w:i w:val="0"/>
+                <w:sz w:val="16"/>
+              </w:rPr>
+              <w:t>$1.1 to 1.5M</w:t>
+            </w:r>
+          </w:p>
+        </w:tc>
+        <w:tc>
+          <w:tcPr>
+            <w:tcW w:type="dxa" w:w="1008"/>
+            <w:shd w:val="clear" w:color="auto" w:fill="F2F4F8"/>
+          </w:tcPr>
+          <w:p>
+            <w:pPr>
+              <w:spacing w:after="0" w:before="0"/>
+            </w:pPr>
+            <w:r/>
+            <w:r>
+              <w:rPr>
+                <w:b w:val="0"/>
+                <w:i w:val="0"/>
+                <w:sz w:val="16"/>
+              </w:rPr>
+              <w:t>Medium</w:t>
+            </w:r>
+          </w:p>
+        </w:tc>
+        <w:tc>
+          <w:tcPr>
+            <w:tcW w:type="dxa" w:w="3168"/>
+            <w:shd w:val="clear" w:color="auto" w:fill="F2F4F8"/>
+          </w:tcPr>
+          <w:p>
+            <w:pPr>
+              <w:spacing w:after="0" w:before="0"/>
+            </w:pPr>
+            <w:r/>
+            <w:r>
+              <w:rPr>
+                <w:b w:val="0"/>
+                <w:i w:val="0"/>
+                <w:sz w:val="16"/>
+              </w:rPr>
+              <w:t>Two recent relay-replacement actuals; confirm the four SEL-735 are protection, not metering; outage windows priced</w:t>
+            </w:r>
+          </w:p>
+        </w:tc>
+      </w:tr>
+      <w:tr>
+        <w:tc>
+          <w:tcPr>
+            <w:tcW w:type="dxa" w:w="504"/>
+          </w:tcPr>
+          <w:p>
+            <w:pPr>
+              <w:spacing w:after="0" w:before="0"/>
+            </w:pPr>
+            <w:r/>
+            <w:r>
+              <w:rPr>
+                <w:b w:val="0"/>
+                <w:i w:val="0"/>
+                <w:sz w:val="16"/>
+              </w:rPr>
+              <w:t>B2</w:t>
+            </w:r>
+          </w:p>
+        </w:tc>
+        <w:tc>
+          <w:tcPr>
+            <w:tcW w:type="dxa" w:w="3744"/>
+          </w:tcPr>
+          <w:p>
+            <w:pPr>
+              <w:spacing w:after="0" w:before="0"/>
+            </w:pPr>
+            <w:r/>
+            <w:r>
+              <w:rPr>
+                <w:b w:val="0"/>
+                <w:i w:val="0"/>
+                <w:sz w:val="16"/>
+              </w:rPr>
+              <w:t>Interconnection topology: five feeder cabinets, four GSUs, four breakers, four metering sets for 10 MW</w:t>
+            </w:r>
+          </w:p>
+        </w:tc>
+        <w:tc>
+          <w:tcPr>
+            <w:tcW w:type="dxa" w:w="720"/>
+          </w:tcPr>
+          <w:p>
+            <w:pPr>
+              <w:spacing w:after="0" w:before="0"/>
+            </w:pPr>
+            <w:r/>
+            <w:r>
+              <w:rPr>
+                <w:b w:val="0"/>
+                <w:i w:val="0"/>
+                <w:sz w:val="16"/>
+              </w:rPr>
+              <w:t>C/D</w:t>
+            </w:r>
+          </w:p>
+        </w:tc>
+        <w:tc>
+          <w:tcPr>
+            <w:tcW w:type="dxa" w:w="1224"/>
+          </w:tcPr>
+          <w:p>
+            <w:pPr>
+              <w:spacing w:after="0" w:before="0"/>
+              <w:jc w:val="right"/>
+            </w:pPr>
+            <w:r/>
+            <w:r>
+              <w:rPr>
+                <w:b w:val="0"/>
+                <w:i w:val="0"/>
+                <w:sz w:val="16"/>
+              </w:rPr>
+              <w:t>$0.9 to 1.4M</w:t>
+            </w:r>
+          </w:p>
+        </w:tc>
+        <w:tc>
+          <w:tcPr>
+            <w:tcW w:type="dxa" w:w="1224"/>
+          </w:tcPr>
+          <w:p>
+            <w:pPr>
+              <w:spacing w:after="0" w:before="0"/>
+              <w:jc w:val="right"/>
+            </w:pPr>
+            <w:r/>
+            <w:r>
+              <w:rPr>
+                <w:b w:val="0"/>
+                <w:i w:val="0"/>
+                <w:sz w:val="16"/>
+              </w:rPr>
+              <w:t>$1.4 to 1.9M</w:t>
+            </w:r>
+          </w:p>
+        </w:tc>
+        <w:tc>
+          <w:tcPr>
+            <w:tcW w:type="dxa" w:w="1008"/>
+          </w:tcPr>
+          <w:p>
+            <w:pPr>
+              <w:spacing w:after="0" w:before="0"/>
+            </w:pPr>
+            <w:r/>
+            <w:r>
+              <w:rPr>
+                <w:b w:val="0"/>
+                <w:i w:val="0"/>
+                <w:sz w:val="16"/>
+              </w:rPr>
+              <w:t>Low</w:t>
+            </w:r>
+          </w:p>
+        </w:tc>
+        <w:tc>
+          <w:tcPr>
+            <w:tcW w:type="dxa" w:w="3168"/>
+          </w:tcPr>
+          <w:p>
+            <w:pPr>
+              <w:spacing w:after="0" w:before="0"/>
+            </w:pPr>
+            <w:r/>
+            <w:r>
+              <w:rPr>
+                <w:b w:val="0"/>
+                <w:i w:val="0"/>
+                <w:sz w:val="16"/>
+              </w:rPr>
+              <w:t>Hosting-capacity study: can two feeders take 5 MW each? If not, the item is zero</w:t>
+            </w:r>
+          </w:p>
+        </w:tc>
+      </w:tr>
+      <w:tr>
+        <w:tc>
+          <w:tcPr>
+            <w:tcW w:type="dxa" w:w="504"/>
+            <w:shd w:val="clear" w:color="auto" w:fill="F2F4F8"/>
+          </w:tcPr>
+          <w:p>
+            <w:pPr>
+              <w:spacing w:after="0" w:before="0"/>
+            </w:pPr>
+            <w:r/>
+            <w:r>
+              <w:rPr>
+                <w:b w:val="0"/>
+                <w:i w:val="0"/>
+                <w:sz w:val="16"/>
+              </w:rPr>
+              <w:t>B3</w:t>
+            </w:r>
+          </w:p>
+        </w:tc>
+        <w:tc>
+          <w:tcPr>
+            <w:tcW w:type="dxa" w:w="3744"/>
+            <w:shd w:val="clear" w:color="auto" w:fill="F2F4F8"/>
+          </w:tcPr>
+          <w:p>
+            <w:pPr>
+              <w:spacing w:after="0" w:before="0"/>
+            </w:pPr>
+            <w:r/>
+            <w:r>
+              <w:rPr>
+                <w:b w:val="0"/>
+                <w:i w:val="0"/>
+                <w:sz w:val="16"/>
+              </w:rPr>
+              <w:t>Platform and retaining wall sized after geotech, not before</w:t>
+            </w:r>
+          </w:p>
+        </w:tc>
+        <w:tc>
+          <w:tcPr>
+            <w:tcW w:type="dxa" w:w="720"/>
+            <w:shd w:val="clear" w:color="auto" w:fill="F2F4F8"/>
+          </w:tcPr>
+          <w:p>
+            <w:pPr>
+              <w:spacing w:after="0" w:before="0"/>
+            </w:pPr>
+            <w:r/>
+            <w:r>
+              <w:rPr>
+                <w:b w:val="0"/>
+                <w:i w:val="0"/>
+                <w:sz w:val="16"/>
+              </w:rPr>
+              <w:t>E</w:t>
+            </w:r>
+          </w:p>
+        </w:tc>
+        <w:tc>
+          <w:tcPr>
+            <w:tcW w:type="dxa" w:w="1224"/>
+            <w:shd w:val="clear" w:color="auto" w:fill="F2F4F8"/>
+          </w:tcPr>
+          <w:p>
+            <w:pPr>
+              <w:spacing w:after="0" w:before="0"/>
+              <w:jc w:val="right"/>
+            </w:pPr>
+            <w:r/>
+            <w:r>
+              <w:rPr>
+                <w:b w:val="0"/>
+                <w:i w:val="0"/>
+                <w:sz w:val="16"/>
+              </w:rPr>
+              <w:t>$0.3 to 0.8M</w:t>
+            </w:r>
+          </w:p>
+        </w:tc>
+        <w:tc>
+          <w:tcPr>
+            <w:tcW w:type="dxa" w:w="1224"/>
+            <w:shd w:val="clear" w:color="auto" w:fill="F2F4F8"/>
+          </w:tcPr>
+          <w:p>
+            <w:pPr>
+              <w:spacing w:after="0" w:before="0"/>
+              <w:jc w:val="right"/>
+            </w:pPr>
+            <w:r/>
+            <w:r>
+              <w:rPr>
+                <w:b w:val="0"/>
+                <w:i w:val="0"/>
+                <w:sz w:val="16"/>
+              </w:rPr>
+              <w:t>$0.4 to 1.2M</w:t>
+            </w:r>
+          </w:p>
+        </w:tc>
+        <w:tc>
+          <w:tcPr>
+            <w:tcW w:type="dxa" w:w="1008"/>
+            <w:shd w:val="clear" w:color="auto" w:fill="F2F4F8"/>
+          </w:tcPr>
+          <w:p>
+            <w:pPr>
+              <w:spacing w:after="0" w:before="0"/>
+            </w:pPr>
+            <w:r/>
+            <w:r>
+              <w:rPr>
+                <w:b w:val="0"/>
+                <w:i w:val="0"/>
+                <w:sz w:val="16"/>
+              </w:rPr>
+              <w:t>Low</w:t>
+            </w:r>
+          </w:p>
+        </w:tc>
+        <w:tc>
+          <w:tcPr>
+            <w:tcW w:type="dxa" w:w="3168"/>
+            <w:shd w:val="clear" w:color="auto" w:fill="F2F4F8"/>
+          </w:tcPr>
+          <w:p>
+            <w:pPr>
+              <w:spacing w:after="0" w:before="0"/>
+            </w:pPr>
+            <w:r/>
+            <w:r>
+              <w:rPr>
+                <w:b w:val="0"/>
+                <w:i w:val="0"/>
+                <w:sz w:val="16"/>
+              </w:rPr>
+              <w:t>Geotech report; MassDEP SW45 post-closure permit conditions; NFPA 855 spacing</w:t>
+            </w:r>
+          </w:p>
+        </w:tc>
+      </w:tr>
+      <w:tr>
+        <w:tc>
+          <w:tcPr>
+            <w:tcW w:type="dxa" w:w="504"/>
+          </w:tcPr>
+          <w:p>
+            <w:pPr>
+              <w:spacing w:after="0" w:before="0"/>
+            </w:pPr>
+            <w:r/>
+            <w:r>
+              <w:rPr>
+                <w:b w:val="0"/>
+                <w:i w:val="0"/>
+                <w:sz w:val="16"/>
+              </w:rPr>
+              <w:t>B4</w:t>
+            </w:r>
+          </w:p>
+        </w:tc>
+        <w:tc>
+          <w:tcPr>
+            <w:tcW w:type="dxa" w:w="3744"/>
+          </w:tcPr>
+          <w:p>
+            <w:pPr>
+              <w:spacing w:after="0" w:before="0"/>
+            </w:pPr>
+            <w:r/>
+            <w:r>
+              <w:rPr>
+                <w:b w:val="0"/>
+                <w:i w:val="0"/>
+                <w:sz w:val="16"/>
+              </w:rPr>
+              <w:t>Battery installation labor from a crew build-up instead of 25% of a 2023 total</w:t>
+            </w:r>
+          </w:p>
+        </w:tc>
+        <w:tc>
+          <w:tcPr>
+            <w:tcW w:type="dxa" w:w="720"/>
+          </w:tcPr>
+          <w:p>
+            <w:pPr>
+              <w:spacing w:after="0" w:before="0"/>
+            </w:pPr>
+            <w:r/>
+            <w:r>
+              <w:rPr>
+                <w:b w:val="0"/>
+                <w:i w:val="0"/>
+                <w:sz w:val="16"/>
+              </w:rPr>
+              <w:t>B</w:t>
+            </w:r>
+          </w:p>
+        </w:tc>
+        <w:tc>
+          <w:tcPr>
+            <w:tcW w:type="dxa" w:w="1224"/>
+          </w:tcPr>
+          <w:p>
+            <w:pPr>
+              <w:spacing w:after="0" w:before="0"/>
+              <w:jc w:val="right"/>
+            </w:pPr>
+            <w:r/>
+            <w:r>
+              <w:rPr>
+                <w:b w:val="0"/>
+                <w:i w:val="0"/>
+                <w:sz w:val="16"/>
+              </w:rPr>
+              <w:t>$0.5 to 0.6M</w:t>
+            </w:r>
+          </w:p>
+        </w:tc>
+        <w:tc>
+          <w:tcPr>
+            <w:tcW w:type="dxa" w:w="1224"/>
+          </w:tcPr>
+          <w:p>
+            <w:pPr>
+              <w:spacing w:after="0" w:before="0"/>
+              <w:jc w:val="right"/>
+            </w:pPr>
+            <w:r/>
+            <w:r>
+              <w:rPr>
+                <w:b w:val="0"/>
+                <w:i w:val="0"/>
+                <w:sz w:val="16"/>
+              </w:rPr>
+              <w:t>$0.7 to 0.9M</w:t>
+            </w:r>
+          </w:p>
+        </w:tc>
+        <w:tc>
+          <w:tcPr>
+            <w:tcW w:type="dxa" w:w="1008"/>
+          </w:tcPr>
+          <w:p>
+            <w:pPr>
+              <w:spacing w:after="0" w:before="0"/>
+            </w:pPr>
+            <w:r/>
+            <w:r>
+              <w:rPr>
+                <w:b w:val="0"/>
+                <w:i w:val="0"/>
+                <w:sz w:val="16"/>
+              </w:rPr>
+              <w:t>Medium</w:t>
+            </w:r>
+          </w:p>
+        </w:tc>
+        <w:tc>
+          <w:tcPr>
+            <w:tcW w:type="dxa" w:w="3168"/>
+          </w:tcPr>
+          <w:p>
+            <w:pPr>
+              <w:spacing w:after="0" w:before="0"/>
+            </w:pPr>
+            <w:r/>
+            <w:r>
+              <w:rPr>
+                <w:b w:val="0"/>
+                <w:i w:val="0"/>
+                <w:sz w:val="16"/>
+              </w:rPr>
+              <w:t>Crew build-up: crane set, anchoring, DC and AC terminations per Voyager unit</w:t>
+            </w:r>
+          </w:p>
+        </w:tc>
+      </w:tr>
+      <w:tr>
+        <w:tc>
+          <w:tcPr>
+            <w:tcW w:type="dxa" w:w="504"/>
+            <w:shd w:val="clear" w:color="auto" w:fill="F2F4F8"/>
+          </w:tcPr>
+          <w:p>
+            <w:pPr>
+              <w:spacing w:after="0" w:before="0"/>
+            </w:pPr>
+            <w:r/>
+            <w:r>
+              <w:rPr>
+                <w:b w:val="0"/>
+                <w:i w:val="0"/>
+                <w:sz w:val="16"/>
+              </w:rPr>
+              <w:t>B5</w:t>
+            </w:r>
+          </w:p>
+        </w:tc>
+        <w:tc>
+          <w:tcPr>
+            <w:tcW w:type="dxa" w:w="3744"/>
+            <w:shd w:val="clear" w:color="auto" w:fill="F2F4F8"/>
+          </w:tcPr>
+          <w:p>
+            <w:pPr>
+              <w:spacing w:after="0" w:before="0"/>
+            </w:pPr>
+            <w:r/>
+            <w:r>
+              <w:rPr>
+                <w:b w:val="0"/>
+                <w:i w:val="0"/>
+                <w:sz w:val="16"/>
+              </w:rPr>
+              <w:t>Breaker package price: $332K each including relays and cabinets</w:t>
+            </w:r>
+          </w:p>
+        </w:tc>
+        <w:tc>
+          <w:tcPr>
+            <w:tcW w:type="dxa" w:w="720"/>
+            <w:shd w:val="clear" w:color="auto" w:fill="F2F4F8"/>
+          </w:tcPr>
+          <w:p>
+            <w:pPr>
+              <w:spacing w:after="0" w:before="0"/>
+            </w:pPr>
+            <w:r/>
+            <w:r>
+              <w:rPr>
+                <w:b w:val="0"/>
+                <w:i w:val="0"/>
+                <w:sz w:val="16"/>
+              </w:rPr>
+              <w:t>D</w:t>
+            </w:r>
+          </w:p>
+        </w:tc>
+        <w:tc>
+          <w:tcPr>
+            <w:tcW w:type="dxa" w:w="1224"/>
+            <w:shd w:val="clear" w:color="auto" w:fill="F2F4F8"/>
+          </w:tcPr>
+          <w:p>
+            <w:pPr>
+              <w:spacing w:after="0" w:before="0"/>
+              <w:jc w:val="right"/>
+            </w:pPr>
+            <w:r/>
+            <w:r>
+              <w:rPr>
+                <w:b w:val="0"/>
+                <w:i w:val="0"/>
+                <w:sz w:val="16"/>
+              </w:rPr>
+              <w:t>$0.3 to 0.5M</w:t>
+            </w:r>
+          </w:p>
+        </w:tc>
+        <w:tc>
+          <w:tcPr>
+            <w:tcW w:type="dxa" w:w="1224"/>
+            <w:shd w:val="clear" w:color="auto" w:fill="F2F4F8"/>
+          </w:tcPr>
+          <w:p>
+            <w:pPr>
+              <w:spacing w:after="0" w:before="0"/>
+              <w:jc w:val="right"/>
+            </w:pPr>
+            <w:r/>
+            <w:r>
+              <w:rPr>
+                <w:b w:val="0"/>
+                <w:i w:val="0"/>
+                <w:sz w:val="16"/>
+              </w:rPr>
+              <w:t>$0.4 to 0.8M</w:t>
+            </w:r>
+          </w:p>
+        </w:tc>
+        <w:tc>
+          <w:tcPr>
+            <w:tcW w:type="dxa" w:w="1008"/>
+            <w:shd w:val="clear" w:color="auto" w:fill="F2F4F8"/>
+          </w:tcPr>
+          <w:p>
+            <w:pPr>
+              <w:spacing w:after="0" w:before="0"/>
+            </w:pPr>
+            <w:r/>
+            <w:r>
+              <w:rPr>
+                <w:b w:val="0"/>
+                <w:i w:val="0"/>
+                <w:sz w:val="16"/>
+              </w:rPr>
+              <w:t>Low</w:t>
+            </w:r>
+          </w:p>
+        </w:tc>
+        <w:tc>
+          <w:tcPr>
+            <w:tcW w:type="dxa" w:w="3168"/>
+            <w:shd w:val="clear" w:color="auto" w:fill="F2F4F8"/>
+          </w:tcPr>
+          <w:p>
+            <w:pPr>
+              <w:spacing w:after="0" w:before="0"/>
+            </w:pPr>
+            <w:r/>
+            <w:r>
+              <w:rPr>
+                <w:b w:val="0"/>
+                <w:i w:val="0"/>
+                <w:sz w:val="16"/>
+              </w:rPr>
+              <w:t>Budgetary quote for the SDV7-class breaker with relay cabinet; confirm what the project team's number includes</w:t>
+            </w:r>
+          </w:p>
+        </w:tc>
+      </w:tr>
+      <w:tr>
+        <w:tc>
+          <w:tcPr>
+            <w:tcW w:type="dxa" w:w="504"/>
+          </w:tcPr>
+          <w:p>
+            <w:pPr>
+              <w:spacing w:after="0" w:before="0"/>
+            </w:pPr>
+            <w:r/>
+            <w:r>
+              <w:rPr>
+                <w:b w:val="0"/>
+                <w:i w:val="0"/>
+                <w:sz w:val="16"/>
+              </w:rPr>
+              <w:t>B6</w:t>
+            </w:r>
+          </w:p>
+        </w:tc>
+        <w:tc>
+          <w:tcPr>
+            <w:tcW w:type="dxa" w:w="3744"/>
+          </w:tcPr>
+          <w:p>
+            <w:pPr>
+              <w:spacing w:after="0" w:before="0"/>
+            </w:pPr>
+            <w:r/>
+            <w:r>
+              <w:rPr>
+                <w:b w:val="0"/>
+                <w:i w:val="0"/>
+                <w:sz w:val="16"/>
+              </w:rPr>
+              <w:t>GSU package price: 3 MVA pad-mounts carried at $267K each from a 2023 bidder list plus 3%/yr</w:t>
+            </w:r>
+          </w:p>
+        </w:tc>
+        <w:tc>
+          <w:tcPr>
+            <w:tcW w:type="dxa" w:w="720"/>
+          </w:tcPr>
+          <w:p>
+            <w:pPr>
+              <w:spacing w:after="0" w:before="0"/>
+            </w:pPr>
+            <w:r/>
+            <w:r>
+              <w:rPr>
+                <w:b w:val="0"/>
+                <w:i w:val="0"/>
+                <w:sz w:val="16"/>
+              </w:rPr>
+              <w:t>C</w:t>
+            </w:r>
+          </w:p>
+        </w:tc>
+        <w:tc>
+          <w:tcPr>
+            <w:tcW w:type="dxa" w:w="1224"/>
+          </w:tcPr>
+          <w:p>
+            <w:pPr>
+              <w:spacing w:after="0" w:before="0"/>
+              <w:jc w:val="right"/>
+            </w:pPr>
+            <w:r/>
+            <w:r>
+              <w:rPr>
+                <w:b w:val="0"/>
+                <w:i w:val="0"/>
+                <w:sz w:val="16"/>
+              </w:rPr>
+              <w:t>$0.2 to 0.4M</w:t>
+            </w:r>
+          </w:p>
+        </w:tc>
+        <w:tc>
+          <w:tcPr>
+            <w:tcW w:type="dxa" w:w="1224"/>
+          </w:tcPr>
+          <w:p>
+            <w:pPr>
+              <w:spacing w:after="0" w:before="0"/>
+              <w:jc w:val="right"/>
+            </w:pPr>
+            <w:r/>
+            <w:r>
+              <w:rPr>
+                <w:b w:val="0"/>
+                <w:i w:val="0"/>
+                <w:sz w:val="16"/>
+              </w:rPr>
+              <w:t>$0.3 to 0.6M</w:t>
+            </w:r>
+          </w:p>
+        </w:tc>
+        <w:tc>
+          <w:tcPr>
+            <w:tcW w:type="dxa" w:w="1008"/>
+          </w:tcPr>
+          <w:p>
+            <w:pPr>
+              <w:spacing w:after="0" w:before="0"/>
+            </w:pPr>
+            <w:r/>
+            <w:r>
+              <w:rPr>
+                <w:b w:val="0"/>
+                <w:i w:val="0"/>
+                <w:sz w:val="16"/>
+              </w:rPr>
+              <w:t>Low</w:t>
+            </w:r>
+          </w:p>
+        </w:tc>
+        <w:tc>
+          <w:tcPr>
+            <w:tcW w:type="dxa" w:w="3168"/>
+          </w:tcPr>
+          <w:p>
+            <w:pPr>
+              <w:spacing w:after="0" w:before="0"/>
+            </w:pPr>
+            <w:r/>
+            <w:r>
+              <w:rPr>
+                <w:b w:val="0"/>
+                <w:i w:val="0"/>
+                <w:sz w:val="16"/>
+              </w:rPr>
+              <w:t>Budgetary quote with the 2026 transformer PPI (1.9x since 2018) and a 29 to 70 week lead time in the schedule</w:t>
+            </w:r>
+          </w:p>
+        </w:tc>
+      </w:tr>
+      <w:tr>
+        <w:tc>
+          <w:tcPr>
+            <w:tcW w:type="dxa" w:w="504"/>
+            <w:shd w:val="clear" w:color="auto" w:fill="F2F4F8"/>
+          </w:tcPr>
+          <w:p>
+            <w:pPr>
+              <w:spacing w:after="0" w:before="0"/>
+            </w:pPr>
+            <w:r/>
+            <w:r>
+              <w:rPr>
+                <w:b w:val="0"/>
+                <w:i w:val="0"/>
+                <w:sz w:val="16"/>
+              </w:rPr>
+              <w:t>C1</w:t>
+            </w:r>
+          </w:p>
+        </w:tc>
+        <w:tc>
+          <w:tcPr>
+            <w:tcW w:type="dxa" w:w="3744"/>
+            <w:shd w:val="clear" w:color="auto" w:fill="F2F4F8"/>
+          </w:tcPr>
+          <w:p>
+            <w:pPr>
+              <w:spacing w:after="0" w:before="0"/>
+            </w:pPr>
+            <w:r/>
+            <w:r>
+              <w:rPr>
+                <w:b w:val="0"/>
+                <w:i w:val="0"/>
+                <w:sz w:val="16"/>
+              </w:rPr>
+              <w:t>Section 48E investment tax credit on the storage property</w:t>
+            </w:r>
+          </w:p>
+        </w:tc>
+        <w:tc>
+          <w:tcPr>
+            <w:tcW w:type="dxa" w:w="720"/>
+            <w:shd w:val="clear" w:color="auto" w:fill="F2F4F8"/>
+          </w:tcPr>
+          <w:p>
+            <w:pPr>
+              <w:spacing w:after="0" w:before="0"/>
+            </w:pPr>
+            <w:r/>
+            <w:r>
+              <w:rPr>
+                <w:b w:val="0"/>
+                <w:i w:val="0"/>
+                <w:sz w:val="16"/>
+              </w:rPr>
+              <w:t>rev. req.</w:t>
+            </w:r>
+          </w:p>
+        </w:tc>
+        <w:tc>
+          <w:tcPr>
+            <w:tcW w:type="dxa" w:w="1224"/>
+            <w:shd w:val="clear" w:color="auto" w:fill="F2F4F8"/>
+          </w:tcPr>
+          <w:p>
+            <w:pPr>
+              <w:spacing w:after="0" w:before="0"/>
+              <w:jc w:val="right"/>
+            </w:pPr>
+            <w:r/>
+            <w:r>
+              <w:rPr>
+                <w:b w:val="0"/>
+                <w:i w:val="0"/>
+                <w:sz w:val="16"/>
+              </w:rPr>
+              <w:t>$8.4 to 12.4M</w:t>
+            </w:r>
+          </w:p>
+        </w:tc>
+        <w:tc>
+          <w:tcPr>
+            <w:tcW w:type="dxa" w:w="1224"/>
+            <w:shd w:val="clear" w:color="auto" w:fill="F2F4F8"/>
+          </w:tcPr>
+          <w:p>
+            <w:pPr>
+              <w:spacing w:after="0" w:before="0"/>
+              <w:jc w:val="right"/>
+            </w:pPr>
+            <w:r/>
+            <w:r>
+              <w:rPr>
+                <w:b w:val="0"/>
+                <w:i w:val="0"/>
+                <w:sz w:val="16"/>
+              </w:rPr>
+              <w:t>$8.4 to 12.4M</w:t>
+            </w:r>
+          </w:p>
+        </w:tc>
+        <w:tc>
+          <w:tcPr>
+            <w:tcW w:type="dxa" w:w="1008"/>
+            <w:shd w:val="clear" w:color="auto" w:fill="F2F4F8"/>
+          </w:tcPr>
+          <w:p>
+            <w:pPr>
+              <w:spacing w:after="0" w:before="0"/>
+            </w:pPr>
+            <w:r/>
+            <w:r>
+              <w:rPr>
+                <w:b w:val="0"/>
+                <w:i w:val="0"/>
+                <w:sz w:val="16"/>
+              </w:rPr>
+              <w:t>Medium</w:t>
+            </w:r>
+          </w:p>
+        </w:tc>
+        <w:tc>
+          <w:tcPr>
+            <w:tcW w:type="dxa" w:w="3168"/>
+            <w:shd w:val="clear" w:color="auto" w:fill="F2F4F8"/>
+          </w:tcPr>
+          <w:p>
+            <w:pPr>
+              <w:spacing w:after="0" w:before="0"/>
+            </w:pPr>
+            <w:r/>
+            <w:r>
+              <w:rPr>
+                <w:b w:val="0"/>
+                <w:i w:val="0"/>
+                <w:sz w:val="16"/>
+              </w:rPr>
+              <w:t>Eligible-basis opinion; FEOC cost-ratio test (65% non-PFE for a 2028 construction start); normalization election; DPU treatment</w:t>
+            </w:r>
+          </w:p>
+        </w:tc>
+      </w:tr>
+      <w:tr>
+        <w:tc>
+          <w:tcPr>
+            <w:tcW w:type="dxa" w:w="504"/>
+          </w:tcPr>
+          <w:p>
+            <w:pPr>
+              <w:spacing w:after="0" w:before="0"/>
+            </w:pPr>
+            <w:r/>
+            <w:r>
+              <w:rPr>
+                <w:b w:val="0"/>
+                <w:i w:val="0"/>
+                <w:sz w:val="16"/>
+              </w:rPr>
+              <w:t>C2</w:t>
+            </w:r>
+          </w:p>
+        </w:tc>
+        <w:tc>
+          <w:tcPr>
+            <w:tcW w:type="dxa" w:w="3744"/>
+          </w:tcPr>
+          <w:p>
+            <w:pPr>
+              <w:spacing w:after="0" w:before="0"/>
+            </w:pPr>
+            <w:r/>
+            <w:r>
+              <w:rPr>
+                <w:b w:val="0"/>
+                <w:i w:val="0"/>
+                <w:sz w:val="16"/>
+              </w:rPr>
+              <w:t>Energy-community adder if the closed landfill qualifies as a brownfield</w:t>
+            </w:r>
+          </w:p>
+        </w:tc>
+        <w:tc>
+          <w:tcPr>
+            <w:tcW w:type="dxa" w:w="720"/>
+          </w:tcPr>
+          <w:p>
+            <w:pPr>
+              <w:spacing w:after="0" w:before="0"/>
+            </w:pPr>
+            <w:r/>
+            <w:r>
+              <w:rPr>
+                <w:b w:val="0"/>
+                <w:i w:val="0"/>
+                <w:sz w:val="16"/>
+              </w:rPr>
+              <w:t>rev. req.</w:t>
+            </w:r>
+          </w:p>
+        </w:tc>
+        <w:tc>
+          <w:tcPr>
+            <w:tcW w:type="dxa" w:w="1224"/>
+          </w:tcPr>
+          <w:p>
+            <w:pPr>
+              <w:spacing w:after="0" w:before="0"/>
+              <w:jc w:val="right"/>
+            </w:pPr>
+            <w:r/>
+            <w:r>
+              <w:rPr>
+                <w:b w:val="0"/>
+                <w:i w:val="0"/>
+                <w:sz w:val="16"/>
+              </w:rPr>
+              <w:t>$2.8 to 4.1M</w:t>
+            </w:r>
+          </w:p>
+        </w:tc>
+        <w:tc>
+          <w:tcPr>
+            <w:tcW w:type="dxa" w:w="1224"/>
+          </w:tcPr>
+          <w:p>
+            <w:pPr>
+              <w:spacing w:after="0" w:before="0"/>
+              <w:jc w:val="right"/>
+            </w:pPr>
+            <w:r/>
+            <w:r>
+              <w:rPr>
+                <w:b w:val="0"/>
+                <w:i w:val="0"/>
+                <w:sz w:val="16"/>
+              </w:rPr>
+              <w:t>$2.8 to 4.1M</w:t>
+            </w:r>
+          </w:p>
+        </w:tc>
+        <w:tc>
+          <w:tcPr>
+            <w:tcW w:type="dxa" w:w="1008"/>
+          </w:tcPr>
+          <w:p>
+            <w:pPr>
+              <w:spacing w:after="0" w:before="0"/>
+            </w:pPr>
+            <w:r/>
+            <w:r>
+              <w:rPr>
+                <w:b w:val="0"/>
+                <w:i w:val="0"/>
+                <w:sz w:val="16"/>
+              </w:rPr>
+              <w:t>Low</w:t>
+            </w:r>
+          </w:p>
+        </w:tc>
+        <w:tc>
+          <w:tcPr>
+            <w:tcW w:type="dxa" w:w="3168"/>
+          </w:tcPr>
+          <w:p>
+            <w:pPr>
+              <w:spacing w:after="0" w:before="0"/>
+            </w:pPr>
+            <w:r/>
+            <w:r>
+              <w:rPr>
+                <w:b w:val="0"/>
+                <w:i w:val="0"/>
+                <w:sz w:val="16"/>
+              </w:rPr>
+              <w:t>Phase II ESA or a prior brownfield-program assessment (the Phase I safe harbor stops at 5 MW)</w:t>
+            </w:r>
+          </w:p>
+        </w:tc>
+      </w:tr>
+      <w:tr>
+        <w:tc>
+          <w:tcPr>
+            <w:tcW w:type="dxa" w:w="504"/>
+            <w:shd w:val="clear" w:color="auto" w:fill="F2F4F8"/>
+          </w:tcPr>
+          <w:p>
+            <w:pPr>
+              <w:spacing w:after="0" w:before="0"/>
+            </w:pPr>
+            <w:r/>
+            <w:r>
+              <w:rPr>
+                <w:b w:val="0"/>
+                <w:i w:val="0"/>
+                <w:sz w:val="16"/>
+              </w:rPr>
+              <w:t>C3</w:t>
+            </w:r>
+          </w:p>
+        </w:tc>
+        <w:tc>
+          <w:tcPr>
+            <w:tcW w:type="dxa" w:w="3744"/>
+            <w:shd w:val="clear" w:color="auto" w:fill="F2F4F8"/>
+          </w:tcPr>
+          <w:p>
+            <w:pPr>
+              <w:spacing w:after="0" w:before="0"/>
+            </w:pPr>
+            <w:r/>
+            <w:r>
+              <w:rPr>
+                <w:b w:val="0"/>
+                <w:i w:val="0"/>
+                <w:sz w:val="16"/>
+              </w:rPr>
+              <w:t>AFUDC: pay the battery at delivery, not a year ahead; protect the siting float</w:t>
+            </w:r>
+          </w:p>
+        </w:tc>
+        <w:tc>
+          <w:tcPr>
+            <w:tcW w:type="dxa" w:w="720"/>
+            <w:shd w:val="clear" w:color="auto" w:fill="F2F4F8"/>
+          </w:tcPr>
+          <w:p>
+            <w:pPr>
+              <w:spacing w:after="0" w:before="0"/>
+            </w:pPr>
+            <w:r/>
+            <w:r>
+              <w:rPr>
+                <w:b w:val="0"/>
+                <w:i w:val="0"/>
+                <w:sz w:val="16"/>
+              </w:rPr>
+              <w:t>M</w:t>
+            </w:r>
+          </w:p>
+        </w:tc>
+        <w:tc>
+          <w:tcPr>
+            <w:tcW w:type="dxa" w:w="1224"/>
+            <w:shd w:val="clear" w:color="auto" w:fill="F2F4F8"/>
+          </w:tcPr>
+          <w:p>
+            <w:pPr>
+              <w:spacing w:after="0" w:before="0"/>
+              <w:jc w:val="right"/>
+            </w:pPr>
+            <w:r/>
+            <w:r>
+              <w:rPr>
+                <w:b w:val="0"/>
+                <w:i w:val="0"/>
+                <w:sz w:val="16"/>
+              </w:rPr>
+              <w:t>$0.3 to 0.7M</w:t>
+            </w:r>
+          </w:p>
+        </w:tc>
+        <w:tc>
+          <w:tcPr>
+            <w:tcW w:type="dxa" w:w="1224"/>
+            <w:shd w:val="clear" w:color="auto" w:fill="F2F4F8"/>
+          </w:tcPr>
+          <w:p>
+            <w:pPr>
+              <w:spacing w:after="0" w:before="0"/>
+              <w:jc w:val="right"/>
+            </w:pPr>
+            <w:r/>
+            <w:r>
+              <w:rPr>
+                <w:b w:val="0"/>
+                <w:i w:val="0"/>
+                <w:sz w:val="16"/>
+              </w:rPr>
+              <w:t>$0.3 to 0.7M</w:t>
+            </w:r>
+          </w:p>
+        </w:tc>
+        <w:tc>
+          <w:tcPr>
+            <w:tcW w:type="dxa" w:w="1008"/>
+            <w:shd w:val="clear" w:color="auto" w:fill="F2F4F8"/>
+          </w:tcPr>
+          <w:p>
+            <w:pPr>
+              <w:spacing w:after="0" w:before="0"/>
+            </w:pPr>
+            <w:r/>
+            <w:r>
+              <w:rPr>
+                <w:b w:val="0"/>
+                <w:i w:val="0"/>
+                <w:sz w:val="16"/>
+              </w:rPr>
+              <w:t>Medium</w:t>
+            </w:r>
+          </w:p>
+        </w:tc>
+        <w:tc>
+          <w:tcPr>
+            <w:tcW w:type="dxa" w:w="3168"/>
+            <w:shd w:val="clear" w:color="auto" w:fill="F2F4F8"/>
+          </w:tcPr>
+          <w:p>
+            <w:pPr>
+              <w:spacing w:after="0" w:before="0"/>
+            </w:pPr>
+            <w:r/>
+            <w:r>
+              <w:rPr>
+                <w:b w:val="0"/>
+                <w:i w:val="0"/>
+                <w:sz w:val="16"/>
+              </w:rPr>
+              <w:t>Milestone payment schedule in the Nomad SOV aligned to 2028 delivery; float target on the ZBA chain</w:t>
+            </w:r>
+          </w:p>
+        </w:tc>
+      </w:tr>
+    </w:tbl>
+    <w:p>
+      <w:pPr>
+        <w:spacing w:after="40"/>
+      </w:pPr>
+    </w:p>
+    <w:tbl>
+      <w:tblPr>
+        <w:tblStyle w:val="TableGrid"/>
+        <w:tblW w:type="auto" w:w="0"/>
+        <w:jc w:val="center"/>
+        <w:tblLayout w:type="fixed"/>
+        <w:tblLook w:firstColumn="1" w:firstRow="1" w:lastColumn="0" w:lastRow="0" w:noHBand="0" w:noVBand="1" w:val="04A0"/>
+      </w:tblPr>
+      <w:tblGrid>
+        <w:gridCol w:w="3456"/>
+        <w:gridCol w:w="2160"/>
+        <w:gridCol w:w="3456"/>
+      </w:tblGrid>
+      <w:tr>
+        <w:tc>
+          <w:tcPr>
+            <w:tcW w:type="dxa" w:w="3456"/>
+            <w:shd w:val="clear" w:color="auto" w:fill="001E60"/>
+          </w:tcPr>
+          <w:p>
+            <w:pPr>
+              <w:spacing w:after="0" w:before="0"/>
+            </w:pPr>
+            <w:r/>
+            <w:r>
+              <w:rPr>
+                <w:b/>
+                <w:i w:val="0"/>
+                <w:color w:val="FFFFFF"/>
+                <w:sz w:val="18"/>
+              </w:rPr>
+              <w:t>Tier</w:t>
+            </w:r>
+          </w:p>
+        </w:tc>
+        <w:tc>
+          <w:tcPr>
+            <w:tcW w:type="dxa" w:w="2160"/>
+            <w:shd w:val="clear" w:color="auto" w:fill="001E60"/>
+          </w:tcPr>
+          <w:p>
+            <w:pPr>
+              <w:spacing w:after="0" w:before="0"/>
+            </w:pPr>
+            <w:r/>
+            <w:r>
+              <w:rPr>
+                <w:b/>
+                <w:i w:val="0"/>
+                <w:color w:val="FFFFFF"/>
+                <w:sz w:val="18"/>
+              </w:rPr>
+              <w:t>Loaded range</w:t>
+            </w:r>
+          </w:p>
+        </w:tc>
+        <w:tc>
+          <w:tcPr>
+            <w:tcW w:type="dxa" w:w="3456"/>
+            <w:shd w:val="clear" w:color="auto" w:fill="001E60"/>
+          </w:tcPr>
+          <w:p>
+            <w:pPr>
+              <w:spacing w:after="0" w:before="0"/>
+            </w:pPr>
+            <w:r/>
+            <w:r>
+              <w:rPr>
+                <w:b/>
+                <w:i w:val="0"/>
+                <w:color w:val="FFFFFF"/>
+                <w:sz w:val="18"/>
+              </w:rPr>
+              <w:t>Against</w:t>
+            </w:r>
+          </w:p>
+        </w:tc>
+      </w:tr>
+      <w:tr>
+        <w:tc>
+          <w:tcPr>
+            <w:tcW w:type="dxa" w:w="3456"/>
+          </w:tcPr>
+          <w:p>
+            <w:pPr>
+              <w:spacing w:after="0" w:before="0"/>
+            </w:pPr>
+            <w:r/>
+            <w:r>
+              <w:rPr>
+                <w:b w:val="0"/>
+                <w:i w:val="0"/>
+                <w:sz w:val="18"/>
+              </w:rPr>
+              <w:t>A. Estimate hygiene</w:t>
+            </w:r>
+          </w:p>
+        </w:tc>
+        <w:tc>
+          <w:tcPr>
+            <w:tcW w:type="dxa" w:w="2160"/>
+          </w:tcPr>
+          <w:p>
+            <w:pPr>
+              <w:spacing w:after="0" w:before="0"/>
+              <w:jc w:val="right"/>
+            </w:pPr>
+            <w:r/>
+            <w:r>
+              <w:rPr>
+                <w:b w:val="0"/>
+                <w:i w:val="0"/>
+                <w:sz w:val="18"/>
+              </w:rPr>
+              <w:t>$5.0 to 7.1M</w:t>
+            </w:r>
+          </w:p>
+        </w:tc>
+        <w:tc>
+          <w:tcPr>
+            <w:tcW w:type="dxa" w:w="3456"/>
+          </w:tcPr>
+          <w:p>
+            <w:pPr>
+              <w:spacing w:after="0" w:before="0"/>
+            </w:pPr>
+            <w:r/>
+            <w:r>
+              <w:rPr>
+                <w:b w:val="0"/>
+                <w:i w:val="0"/>
+                <w:sz w:val="18"/>
+              </w:rPr>
+              <w:t>the $57.2M approval level</w:t>
+            </w:r>
+          </w:p>
+        </w:tc>
+      </w:tr>
+      <w:tr>
+        <w:tc>
+          <w:tcPr>
+            <w:tcW w:type="dxa" w:w="3456"/>
+            <w:shd w:val="clear" w:color="auto" w:fill="F2F4F8"/>
+          </w:tcPr>
+          <w:p>
+            <w:pPr>
+              <w:spacing w:after="0" w:before="0"/>
+            </w:pPr>
+            <w:r/>
+            <w:r>
+              <w:rPr>
+                <w:b w:val="0"/>
+                <w:i w:val="0"/>
+                <w:sz w:val="18"/>
+              </w:rPr>
+              <w:t>B. Value engineering</w:t>
+            </w:r>
+          </w:p>
+        </w:tc>
+        <w:tc>
+          <w:tcPr>
+            <w:tcW w:type="dxa" w:w="2160"/>
+            <w:shd w:val="clear" w:color="auto" w:fill="F2F4F8"/>
+          </w:tcPr>
+          <w:p>
+            <w:pPr>
+              <w:spacing w:after="0" w:before="0"/>
+              <w:jc w:val="right"/>
+            </w:pPr>
+            <w:r/>
+            <w:r>
+              <w:rPr>
+                <w:b w:val="0"/>
+                <w:i w:val="0"/>
+                <w:sz w:val="18"/>
+              </w:rPr>
+              <w:t>$4.3 to 6.9M</w:t>
+            </w:r>
+          </w:p>
+        </w:tc>
+        <w:tc>
+          <w:tcPr>
+            <w:tcW w:type="dxa" w:w="3456"/>
+            <w:shd w:val="clear" w:color="auto" w:fill="F2F4F8"/>
+          </w:tcPr>
+          <w:p>
+            <w:pPr>
+              <w:spacing w:after="0" w:before="0"/>
+            </w:pPr>
+            <w:r/>
+            <w:r>
+              <w:rPr>
+                <w:b w:val="0"/>
+                <w:i w:val="0"/>
+                <w:sz w:val="18"/>
+              </w:rPr>
+              <w:t>the $57.2M approval level</w:t>
+            </w:r>
+          </w:p>
+        </w:tc>
+      </w:tr>
+      <w:tr>
+        <w:tc>
+          <w:tcPr>
+            <w:tcW w:type="dxa" w:w="3456"/>
+          </w:tcPr>
+          <w:p>
+            <w:pPr>
+              <w:spacing w:after="0" w:before="0"/>
+            </w:pPr>
+            <w:r/>
+            <w:r>
+              <w:rPr>
+                <w:b w:val="0"/>
+                <w:i w:val="0"/>
+                <w:sz w:val="18"/>
+              </w:rPr>
+              <w:t>A + B</w:t>
+            </w:r>
+          </w:p>
+        </w:tc>
+        <w:tc>
+          <w:tcPr>
+            <w:tcW w:type="dxa" w:w="2160"/>
+          </w:tcPr>
+          <w:p>
+            <w:pPr>
+              <w:spacing w:after="0" w:before="0"/>
+              <w:jc w:val="right"/>
+            </w:pPr>
+            <w:r/>
+            <w:r>
+              <w:rPr>
+                <w:b w:val="0"/>
+                <w:i w:val="0"/>
+                <w:sz w:val="18"/>
+              </w:rPr>
+              <w:t>$9.3 to 14.0M</w:t>
+            </w:r>
+          </w:p>
+        </w:tc>
+        <w:tc>
+          <w:tcPr>
+            <w:tcW w:type="dxa" w:w="3456"/>
+          </w:tcPr>
+          <w:p>
+            <w:pPr>
+              <w:spacing w:after="0" w:before="0"/>
+            </w:pPr>
+            <w:r/>
+            <w:r>
+              <w:rPr>
+                <w:b w:val="0"/>
+                <w:i w:val="0"/>
+                <w:sz w:val="18"/>
+              </w:rPr>
+              <w:t>the $57.2M approval level</w:t>
+            </w:r>
+          </w:p>
+        </w:tc>
+      </w:tr>
+      <w:tr>
+        <w:tc>
+          <w:tcPr>
+            <w:tcW w:type="dxa" w:w="3456"/>
+            <w:shd w:val="clear" w:color="auto" w:fill="F2F4F8"/>
+          </w:tcPr>
+          <w:p>
+            <w:pPr>
+              <w:spacing w:after="0" w:before="0"/>
+            </w:pPr>
+            <w:r/>
+            <w:r>
+              <w:rPr>
+                <w:b w:val="0"/>
+                <w:i w:val="0"/>
+                <w:sz w:val="18"/>
+              </w:rPr>
+              <w:t>Haugland reconciliation (red team KS1)</w:t>
+            </w:r>
+          </w:p>
+        </w:tc>
+        <w:tc>
+          <w:tcPr>
+            <w:tcW w:type="dxa" w:w="2160"/>
+            <w:shd w:val="clear" w:color="auto" w:fill="F2F4F8"/>
+          </w:tcPr>
+          <w:p>
+            <w:pPr>
+              <w:spacing w:after="0" w:before="0"/>
+              <w:jc w:val="right"/>
+            </w:pPr>
+            <w:r/>
+            <w:r>
+              <w:rPr>
+                <w:b w:val="0"/>
+                <w:i w:val="0"/>
+                <w:sz w:val="18"/>
+              </w:rPr>
+              <w:t>+$4 to 8M direct</w:t>
+            </w:r>
+          </w:p>
+        </w:tc>
+        <w:tc>
+          <w:tcPr>
+            <w:tcW w:type="dxa" w:w="3456"/>
+            <w:shd w:val="clear" w:color="auto" w:fill="F2F4F8"/>
+          </w:tcPr>
+          <w:p>
+            <w:pPr>
+              <w:spacing w:after="0" w:before="0"/>
+            </w:pPr>
+            <w:r/>
+            <w:r>
+              <w:rPr>
+                <w:b w:val="0"/>
+                <w:i w:val="0"/>
+                <w:sz w:val="18"/>
+              </w:rPr>
+              <w:t>the $57.2M approval level</w:t>
+            </w:r>
+          </w:p>
+        </w:tc>
+      </w:tr>
+      <w:tr>
+        <w:tc>
+          <w:tcPr>
+            <w:tcW w:type="dxa" w:w="3456"/>
+          </w:tcPr>
+          <w:p>
+            <w:pPr>
+              <w:spacing w:after="0" w:before="0"/>
+            </w:pPr>
+            <w:r/>
+            <w:r>
+              <w:rPr>
+                <w:b w:val="0"/>
+                <w:i w:val="0"/>
+                <w:sz w:val="18"/>
+              </w:rPr>
+              <w:t>C. Financial and structural</w:t>
+            </w:r>
+          </w:p>
+        </w:tc>
+        <w:tc>
+          <w:tcPr>
+            <w:tcW w:type="dxa" w:w="2160"/>
+          </w:tcPr>
+          <w:p>
+            <w:pPr>
+              <w:spacing w:after="0" w:before="0"/>
+              <w:jc w:val="right"/>
+            </w:pPr>
+            <w:r/>
+            <w:r>
+              <w:rPr>
+                <w:b w:val="0"/>
+                <w:i w:val="0"/>
+                <w:sz w:val="18"/>
+              </w:rPr>
+              <w:t>$11.6 to 17.2M</w:t>
+            </w:r>
+          </w:p>
+        </w:tc>
+        <w:tc>
+          <w:tcPr>
+            <w:tcW w:type="dxa" w:w="3456"/>
+          </w:tcPr>
+          <w:p>
+            <w:pPr>
+              <w:spacing w:after="0" w:before="0"/>
+            </w:pPr>
+            <w:r/>
+            <w:r>
+              <w:rPr>
+                <w:b w:val="0"/>
+                <w:i w:val="0"/>
+                <w:sz w:val="18"/>
+              </w:rPr>
+              <w:t>the revenue requirement</w:t>
+            </w:r>
+          </w:p>
+        </w:tc>
+      </w:tr>
+    </w:tbl>
+    <w:p>
+      <w:pPr>
+        <w:spacing w:after="40"/>
+      </w:pPr>
+    </w:p>
+    <w:p>
+      <w:pPr>
+        <w:spacing w:after="120"/>
+      </w:pPr>
+      <w:r>
+        <w:rPr>
+          <w:b w:val="0"/>
+          <w:i w:val="0"/>
+        </w:rPr>
+        <w:t>Three readings. First, Tiers A and B together ($9.3 to 14.0M) are the same order of magnitude as the red team's Haugland gap (+$4 million to +$8 million direct), and they are gross of it. The honest planning case is a $57 million number that holds, not one that falls, and a value-engineering deduct booked into the PAF ahead of its study is how estimates reach $74 million. Second, the three levers to pursue now cost almost nothing: A1 and A2 are a decision and a re-wording worth about $3 million loaded; B1 is two calls to EMA for recent relay-replacement actuals, against a Station 496 program that carries 710 man-hours and $362,655 per relay for hardware worth $91,438 in total; C1 is a memo to Tax. Third, the largest lever is not in the estimate at all.</w:t>
+      </w:r>
+    </w:p>
+    <w:p>
+      <w:pPr>
+        <w:spacing w:after="120"/>
+      </w:pPr>
+      <w:r>
+        <w:rPr>
+          <w:b w:val="0"/>
+          <w:i w:val="0"/>
+        </w:rPr>
+        <w:t>The Section 48E clean electricity investment credit applies to energy storage technology placed in service by a regulated utility. At the 30 percent rate (prevailing wage and apprenticeship) on an eligible basis bracketed by the loaded battery layers ($28.1M: contract, installation, balance of plant) and those plus station, site and testing ($41.2M), the credit is $8.4 to 12.4M, with a further $2.8 to 4.1M if the closed landfill qualifies as a brownfield energy community. Five things must close before it can be counted, and the research behind them is search-excerpt sourced and to be confirmed by Tax: an eligible-basis opinion (interconnection property at Station 496 sits outside the 48E storage definition); the prohibited-foreign-entity test under IRS Notice 2026-15, which requires at least 65 percent of direct cost from outside prohibited entities for a 2028 construction start while the IRS safe-harbor table puts cells at 52 percent of equipment cost, so the origin of the Voyager cells decides the credit; the normalization election for storage that the Inflation Reduction Act added to section 50(d)(2) and the DPU's treatment of the credit, on which there is no Massachusetts precedent because the Outer Cape and Nantucket batteries pre-date storage eligibility; prevailing-wage and apprenticeship language in the construction contracts; and, for the adder, a Phase II environmental assessment or a prior brownfield-program assessment, because the Phase I safe harbor stops at 5 MW. Storage is exempt from the July 2025 law's wind and solar cliff, with the full credit available for construction beginning through 2033.</w:t>
+      </w:r>
+    </w:p>
+    <w:p>
+      <w:pPr>
+        <w:pStyle w:val="Heading1"/>
+      </w:pPr>
+      <w:r>
+        <w:t>9. Recommendations</w:t>
       </w:r>
     </w:p>
     <w:p>
@@ -8312,6 +12939,36 @@
       </w:r>
       <w:r>
         <w:t>and present the full-funding request at its real maturity. Until the geotechnical report, the hazard mitigation analysis and the Haugland reconciliation close, that is Class 4, minus 25 to plus 50 percent; the layered view should be its first exhibit and the range should be stated in dollars, $43 million to $86 million, not in percentages.</w:t>
+      </w:r>
+    </w:p>
+    <w:p>
+      <w:pPr>
+        <w:pStyle w:val="ListBullet"/>
+        <w:spacing w:after="60"/>
+      </w:pPr>
+      <w:r>
+        <w:rPr>
+          <w:b/>
+        </w:rPr>
+        <w:t xml:space="preserve">Open the Section 48E question with Tax before the November PAF. </w:t>
+      </w:r>
+      <w:r>
+        <w:t>Eligible basis, the prohibited-foreign-entity cost ratio on the Voyager cells and modules, the normalization election and the DPU treatment. The credit is larger than every estimate-side lever combined, and the cell-origin question has a deadline: Nomad's final-drawings milestone.</w:t>
+      </w:r>
+    </w:p>
+    <w:p>
+      <w:pPr>
+        <w:pStyle w:val="ListBullet"/>
+        <w:spacing w:after="60"/>
+      </w:pPr>
+      <w:r>
+        <w:rPr>
+          <w:b/>
+        </w:rPr>
+        <w:t xml:space="preserve">Work the savings register in tier order. </w:t>
+      </w:r>
+      <w:r>
+        <w:t>Decide A1 and re-word A2 now; benchmark the Station 496 relay program against two recent actuals; hold every Tier B item out of the PAF until its study closes.</w:t>
       </w:r>
     </w:p>
     <w:p>
@@ -8420,6 +13077,24 @@
     </w:p>
     <w:p>
       <w:pPr>
+        <w:pStyle w:val="ListBullet"/>
+        <w:spacing w:after="60"/>
+      </w:pPr>
+      <w:r>
+        <w:t>Escalator series (section 5.3): FRED and BLS APIs, 3 Oct 2026 (WPU117409, WPU1175, WPU4532, PCU541330541330, CIU2012300000000I, WPUIP2300001, WPU117); Massachusetts DLS prevailing-wage schedules and Boston JATC rate sheets (IBEW Local 103, 2018-2026); ENR Construction Cost Index reproductions (MWD 2018, City of San Francisco AICCIE 2024, ENR 2025 monthly); PJM Handy-Whitman posting and the Cost Estimating CoE extraction of Bulletin 198.</w:t>
+      </w:r>
+    </w:p>
+    <w:p>
+      <w:pPr>
+        <w:pStyle w:val="ListBullet"/>
+        <w:spacing w:after="60"/>
+      </w:pPr>
+      <w:r>
+        <w:t>Savings register (section 8): Rev 3 rows; Haugland Attachment 4-E; IRS Notice 2026-15 and law-firm summaries of the July 2025 reconciliation act (section 48E, 50(d)(2), 6418); Siemens SDV7 and pad-mount transformer dealer listings; NREL ATB 2021 installation-labor line; National Grid Massachusetts feeder interconnection limits (Sandia GESDB summary).</w:t>
+      </w:r>
+    </w:p>
+    <w:p>
+      <w:pPr>
         <w:pStyle w:val="Heading1"/>
       </w:pPr>
       <w:r>
@@ -17453,7 +22128,7 @@
         <w:color w:val="595959"/>
         <w:sz w:val="16"/>
       </w:rPr>
-      <w:t>Eversource Energy | Cost Estimating Center of Excellence | The Battery Is Not the Project | 2 Oct 2026 | Internal, contains vendor-confidential pricing</w:t>
+      <w:t>Eversource Energy | Cost Estimating Center of Excellence | The Battery Is Not the Project | 3 Oct 2026 | Internal, contains vendor-confidential pricing</w:t>
     </w:r>
   </w:p>
 </w:ftr>

</xml_diff>

<commit_message>
Integrated Monte Carlo on cost, scope and schedule with a tornado of opportunities and threats, and a ranked list of where to be aggressive
- mc_scope_schedule.py: 20,000 trials carrying layer accuracy ranges, unpriced threats (Haugland reconciliation, sound mitigation, screening, police details, NFPA 855, GSU count, change orders, outage premiums), the savings levers at assessed odds, and a siting/long-lead/construction schedule model priced per month; three postures against the $57.2M approval
- Results: status quo P50 $60.7M (approval holds 29%); managed P50 $54.3M (holds 71%); ceiling P50 $48.9M; schedule P50 +5 months, P80 +9; Haugland reconciliation 58% of variance, schedule 14%
- Slides 34-36 (aggressiveness ranking, simulation, tornado); whitepaper 8.3; BOE 18; workbook tab MC Scope Schedule; README and research log addendum (h)

Co-Authored-By: Claude Fable 5.1 <noreply@anthropic.com>
Claude-Session: https://claude.ai/code/session_01YAU7MDk5K6GEm6c4td5TUq
</commit_message>
<xml_diff>
--- a/Hyde Park BESS/6) Cost Analysis Deliverables/Hyde Park BESS - All-In Cost Whitepaper.docx
+++ b/Hyde Park BESS/6) Cost Analysis Deliverables/Hyde Park BESS - All-In Cost Whitepaper.docx
@@ -15240,6 +15240,38 @@
       <w:pPr>
         <w:spacing w:after="40"/>
       </w:pPr>
+    </w:p>
+    <w:p>
+      <w:pPr>
+        <w:pStyle w:val="Heading2"/>
+      </w:pPr>
+      <w:r>
+        <w:t>8.3 Monte Carlo on cost, scope and schedule</w:t>
+      </w:r>
+    </w:p>
+    <w:p>
+      <w:pPr>
+        <w:spacing w:after="120"/>
+      </w:pPr>
+      <w:r>
+        <w:rPr>
+          <w:b w:val="0"/>
+          <w:i w:val="0"/>
+        </w:rPr>
+        <w:t>The scope challenge was then put through a 20,000-trial simulation that carries four things at once: the estimate-accuracy ranges by layer from the red team's model, the threats the estimate does not carry (the Haugland reconciliation at 60 percent odds of adding $2 million to $8 million direct; sound mitigation, screening, police details, NFPA 855 changes, the GSU count, Nomad change orders, outage premiums), the savings levers at their assessed odds of realization, and a schedule model in which the siting chain slips in half the trials by two to fourteen months, an EFSB path occurs in eight percent, long-lead equipment slips in thirty percent, and each month costs $0.30 million to $0.45 million. Outcomes are measured against the $57.2 million approval, which includes the $7.6 million of reserves. If no lever is pursued the median outcome is $60.7 million and the approval holds in 29% of trials. If the levers are worked at the odds assessed the median is $54.3 million, the approval holds in 71% of trials and the outcome lands under $50 million in 24%. If every lever lands the median is $48.9 million. The median schedule slip is 5 months (P80 9), costing about $1.8 million.</w:t>
+      </w:r>
+    </w:p>
+    <w:p>
+      <w:pPr>
+        <w:spacing w:after="120"/>
+      </w:pPr>
+      <w:r>
+        <w:rPr>
+          <w:b w:val="0"/>
+          <w:i w:val="0"/>
+        </w:rPr>
+        <w:t>The tornado is the useful picture. The Haugland reconciliation alone carries 58% of the variance in the outcome and reaches $9 million at P90; schedule slip carries 14%; the civil layer and the Station 496 program are the two accuracy ranges with real upside. On the opportunity side no single lever exceeds $2 million, but the set is worth about $6.3 million at the assessed odds and $11.8 million if every one lands, and the four that need only a decision (the battery escalation, the risk-register wording, the disconnect double count, the AFUDC timing) are the surest. The instruction to be more aggressive therefore has two halves: aggression on the station lines buys $3 million to $6 million; aggression on the reconciliation and the siting calendar protects $8 million to $13 million. Both, in that order.</w:t>
+      </w:r>
     </w:p>
     <w:p>
       <w:pPr>

</xml_diff>